<commit_message>
build(paper): regenera entregables con las correcciones de auditoria
DOCX, HTML y PDF de manuscrito, version ES y portada sincronizados con las
mejoras de abstract, introduccion, discusion y conclusiones.
</commit_message>
<xml_diff>
--- a/entregables/manuscrito.docx
+++ b/entregables/manuscrito.docx
@@ -32,7 +32,7 @@
         <w:pStyle w:val="FirstParagraph"/>
       </w:pPr>
       <w:r>
-        <w:t>Wildfire machine learning often suffers from spatial leakage and the limited transferability of boreal fire-weather indices to subtropical biomes. We introduce D2, a computational target operator that formally separates primary ignition from tactical propagation, and a gated inference and evaluation framework that makes target construction, leakage control and model comparison explicit. D2 defines ignition as fire on day</w:t>
+        <w:t>Wildfire machine learning often suffers from spatial leakage and the limited transferability of boreal fire-weather indices to subtropical biomes. For Paraguay’s 1-km² Chaco–Oriental grid (2018–2025), we introduce D2, a computational target operator that formally separates primary ignition from tactical propagation, and a gated inference and evaluation framework that makes target construction, leakage control and model comparison explicit. D2 defines ignition as fire on day</w:t>
       </w:r>
       <w:r>
         <w:t xml:space="preserve"> </w:t>
@@ -87,7 +87,7 @@
         <w:t>t</w:t>
       </w:r>
       <w:r>
-        <w:t>−1 fire inputs, using M2 as a fallback for cells without history and M1 as a biophysical baseline. On 2023 validation, M3 reaches area under the receiver operating characteristic curve (ROC-AUC) 0.7844/0.7628 (Chaco/Oriental) versus 0.7817/0.7496 for M2. In 2023 development spatial blocks, M2 is the most robust model (0.6773/0.7470), and M1 does not outperform M2 on cells without history. An independent confirmation holdout retained M2 as the best spatial model (0.6871/0.6621). On the retrospective 2024–2025 test, M3 reaches 0.8021/0.7534 versus 0.5173/0.5564 for the Canadian Forest Fire Weather Index (FWI) and 0.5389/0.4990 for the INPE Risco de Fogo; propagation reaches 0.9039/0.7859. Population-level ignition precision is 0.082 %/0.198 %, confirming that the system is a nowcasting and prioritization tool rather than a stand-alone warning system. The computational contribution lies in the D2 operator, the gated inference policy and the open evaluation harness released as reproducible software.</w:t>
+        <w:t>−1 fire inputs, using M2 as a fallback for cells without history and M1 as a biophysical baseline. On 2023 validation, M3 reaches an area under the receiver operating characteristic curve (ROC-AUC) of 0.7844/0.7628 (Chaco/Oriental) versus 0.7817/0.7496 for M2. In 2023 spatial blocks, M2 is most robust (0.6773/0.7470); M1 does not beat M2 on cells without history. An independent confirmation holdout also retained M2 (0.6871/0.6621). On the retrospective 2024–2025 test, M3 reaches 0.8021/0.7534 versus 0.5173/0.5564 for the Canadian Forest Fire Weather Index (FWI) and 0.5389/0.4990 for the INPE Risco de Fogo; propagation reaches 0.9039/0.7859. Population-level ignition precision is 0.082 %/0.198 %, confirming that the system is a nowcasting and prioritization tool rather than a stand-alone warning system. The contribution lies in the open D2 operator, gated inference and evaluation harness, released as reproducible software.</w:t>
       </w:r>
     </w:p>
     <w:p>
@@ -162,7 +162,71 @@
         <w:t>(Setzer et al., 2019)</w:t>
       </w:r>
       <w:r>
-        <w:t>. These indices are widely used, but they were not designed for the moisture-limited, fuel-limited and strongly anthropogenic ignition regime of the Dry Chaco. The analysis covers the continuous 2018–2025 Visible Infrared Imaging Radiometer Suite (VIIRS) record over 400 006 cells</w:t>
+        <w:t>. These indices are widely used, but they were not designed for the moisture-limited, fuel-limited and strongly anthropogenic ignition regime of the Dry Chaco.</w:t>
+      </w:r>
+    </w:p>
+    <w:p>
+      <w:pPr>
+        <w:pStyle w:val="BodyText"/>
+      </w:pPr>
+      <w:r>
+        <w:t>Machine learning has become a common alternative for fire susceptibility mapping</w:t>
+      </w:r>
+      <w:r>
+        <w:t xml:space="preserve"> </w:t>
+      </w:r>
+      <w:r>
+        <w:t>(Barmpoutis et al., 2020; Jain et al., 2020)</w:t>
+      </w:r>
+      <w:r>
+        <w:t>, typically with gradient-boosted trees</w:t>
+      </w:r>
+      <w:r>
+        <w:t xml:space="preserve"> </w:t>
+      </w:r>
+      <w:r>
+        <w:t>(Ke et al., 2017)</w:t>
+      </w:r>
+      <w:r>
+        <w:t>. Two methodological problems limit the operational value of many published models. First, when spatial lags or</w:t>
+      </w:r>
+      <w:r>
+        <w:t xml:space="preserve"> </w:t>
+      </w:r>
+      <w:r>
+        <w:rPr>
+          <w:i/>
+          <w:iCs/>
+        </w:rPr>
+        <w:t>t</w:t>
+      </w:r>
+      <w:r>
+        <w:t>−1 fire variables enter the ignition layer, the model learns persistence rather than ignition; reported discrimination can be high while the model is unable to anticipate new ignitions</w:t>
+      </w:r>
+      <w:r>
+        <w:t xml:space="preserve"> </w:t>
+      </w:r>
+      <w:r>
+        <w:t>(Dormann et al., 2007; Legendre, 1993; Ploton et al., 2020; Roberts et al., 2017; Tobler, 1970)</w:t>
+      </w:r>
+      <w:r>
+        <w:t>. Second, fire-weather indices calibrated in boreal or temperate systems do not necessarily transfer to subtropical biomes, and their failure is rarely quantified on a common retrospective test. A reproducible benchmark is therefore needed not only to compare models, but to make the target definition, the leakage controls and the evaluation protocol explicit enough to be audited. The two tasks are also physically distinct: primary ignition is controlled by fine-fuel curing, atmospheric water demand and human land management, whereas tactical propagation is governed by thermal radiation and the proximity of active perimeters. Conflating both processes into a single binary label does not only introduce a statistical shortcut; it also mixes two different physical regimes that respond to different predictors.</w:t>
+      </w:r>
+    </w:p>
+    <w:p>
+      <w:pPr>
+        <w:pStyle w:val="BodyText"/>
+      </w:pPr>
+      <w:r>
+        <w:t>The operational context adds a third constraint: most agencies need a daily product that can run on commodity hardware, with transparent inputs and a documented failure mode. A model that cannot be reproduced or audited is difficult to adopt even when its aggregate score is high. The framework is therefore designed around explicit targets, a frozen test and a small, inspectable software stack.</w:t>
+      </w:r>
+    </w:p>
+    <w:p>
+      <w:pPr>
+        <w:pStyle w:val="BodyText"/>
+      </w:pPr>
+      <w:r>
+        <w:t>We address these methodological and operational constraints over the continuous 2018–2025 Visible Infrared Imaging Radiometer Suite (VIIRS) record (Suomi-NPP, NOAA-20 and NOAA-21) across a 1-km² national grid of Paraguay (400 006 cells)</w:t>
       </w:r>
       <w:r>
         <w:t xml:space="preserve"> </w:t>
@@ -171,66 +235,7 @@
         <w:t>(Schroeder et al., 2014)</w:t>
       </w:r>
       <w:r>
-        <w:t>, a period in which the multi-sensor VIIRS constellation (Suomi-NPP, NOAA-20 and NOAA-21) provides a comparatively consistent sampling effort.</w:t>
-      </w:r>
-    </w:p>
-    <w:p>
-      <w:pPr>
-        <w:pStyle w:val="BodyText"/>
-      </w:pPr>
-      <w:r>
-        <w:t>Machine learning has become a common alternative for fire susceptibility mapping</w:t>
-      </w:r>
-      <w:r>
-        <w:t xml:space="preserve"> </w:t>
-      </w:r>
-      <w:r>
-        <w:t>(Barmpoutis et al., 2020; Jain et al., 2020)</w:t>
-      </w:r>
-      <w:r>
-        <w:t>, typically with gradient-boosted trees</w:t>
-      </w:r>
-      <w:r>
-        <w:t xml:space="preserve"> </w:t>
-      </w:r>
-      <w:r>
-        <w:t>(Ke et al., 2017)</w:t>
-      </w:r>
-      <w:r>
-        <w:t>. Two methodological problems limit the operational value of many published models. First, when spatial lags or t-1 fire variables enter the ignition layer, the model learns persistence rather than ignition; reported discrimination can be high while the model is unable to anticipate new ignitions</w:t>
-      </w:r>
-      <w:r>
-        <w:t xml:space="preserve"> </w:t>
-      </w:r>
-      <w:r>
-        <w:t>(Dormann et al., 2007; Legendre, 1993; Ploton et al., 2020; Roberts et al., 2017; Tobler, 1970)</w:t>
-      </w:r>
-      <w:r>
-        <w:t>. Second, fire-weather indices calibrated in boreal or temperate systems do not necessarily transfer to subtropical biomes, and their failure is rarely quantified on a common retrospective test. A reproducible benchmark is therefore needed not only to compare models, but to make the target definition, the leakage controls and the evaluation protocol explicit enough to be audited. The two tasks are also physically distinct: primary ignition is controlled by fine-fuel curing, atmospheric water demand and human land management, whereas tactical propagation is governed by thermal radiation and the proximity of active perimeters. Conflating both processes into a single binary label does not only introduce a statistical shortcut; it also mixes two different physical regimes that respond to different predictors.</w:t>
-      </w:r>
-    </w:p>
-    <w:p>
-      <w:pPr>
-        <w:pStyle w:val="BodyText"/>
-      </w:pPr>
-      <w:r>
-        <w:t>The operational context adds a third constraint: most agencies need a daily product that can run on commodity hardware, with transparent inputs and a documented failure mode. A model that cannot be reproduced or audited is difficult to adopt even when its aggregate score is high. The framework is therefore designed around explicit targets, a frozen test and a small, inspectable software stack.</w:t>
-      </w:r>
-    </w:p>
-    <w:p>
-      <w:pPr>
-        <w:pStyle w:val="BodyText"/>
-      </w:pPr>
-      <w:r>
-        <w:t>We address both problems by formalizing four reusable computational contributions, while keeping the learner intentionally replaceable: (i) a D2 target operator that separates primary ignition from tactical propagation; (ii) a gated inference architecture that uses a hybrid model (M3) where fire history exists and a base model (M2) where it does not; (iii) an evaluation harness that combines temporal holdout, spatial blocks, grouped bootstrap, lead-time and cost-loss analysis; and (iv) an open software and data infrastructure based on vectorized, zero-copy pipelines. The geoscientific contribution is a transferable, leakage-controlled benchmark: full FWI and INPE are tested under the same D2 protocol in the Gran Chaco, and the temporal versus spatial limits of the hybrid model are reported explicitly.</w:t>
-      </w:r>
-    </w:p>
-    <w:p>
-      <w:pPr>
-        <w:pStyle w:val="BodyText"/>
-      </w:pPr>
-      <w:r>
-        <w:t>The novelty is computational and infrastructural: D2 formalizes the target contract, gated inference defines the operational policy, the harness makes spatial, temporal, calibration and cost-loss evidence reproducible, and the software exposes the contract to other learners. The national case study is a testbed for data-scarce subtropical regions; we do not claim universal validity. The main computational contributions are:</w:t>
+        <w:t>. While keeping the underlying learner intentionally replaceable, we formalize four reusable computational contributions:</w:t>
       </w:r>
     </w:p>
     <w:p>
@@ -252,7 +257,7 @@
         <w:t xml:space="preserve"> </w:t>
       </w:r>
       <w:r>
-        <w:t>A reproducible rule that prevents persistence from being mixed with ignition and makes leakage checks explicit.</w:t>
+        <w:t>A formal target contract that separates primary ignition from tactical propagation, prevents persistence from being mixed with ignition and makes leakage checks explicit.</w:t>
       </w:r>
     </w:p>
     <w:p>
@@ -268,13 +273,13 @@
           <w:b/>
           <w:bCs/>
         </w:rPr>
-        <w:t>M3/M2 inference.</w:t>
-      </w:r>
-      <w:r>
-        <w:t xml:space="preserve"> </w:t>
-      </w:r>
-      <w:r>
-        <w:t>A two-stage architecture that combines biophysical screening with a hybrid ignition model and a fallback for cells without fire history.</w:t>
+        <w:t>Gated M3/M2 inference.</w:t>
+      </w:r>
+      <w:r>
+        <w:t xml:space="preserve"> </w:t>
+      </w:r>
+      <w:r>
+        <w:t>A two-stage policy that combines biophysical screening with a recurrence-aware hybrid model (M3) where fire history exists and a historical-anchor fallback (M2) where it does not.</w:t>
       </w:r>
     </w:p>
     <w:p>
@@ -296,7 +301,7 @@
         <w:t xml:space="preserve"> </w:t>
       </w:r>
       <w:r>
-        <w:t>Grouped bootstrap, spatial blocks, lead-time, conformal coverage and cost-loss in one protocol.</w:t>
+        <w:t>A unified protocol that integrates temporal holdout, spatial blocks, date-grouped bootstrap, lead-time analysis, conformal coverage and cost-loss evaluation.</w:t>
       </w:r>
     </w:p>
     <w:p>
@@ -318,12 +323,20 @@
         <w:t xml:space="preserve"> </w:t>
       </w:r>
       <w:r>
-        <w:t>A zero-copy Polars/DuckDB pipeline, public code, DOIs and tests.</w:t>
+        <w:t>A vectorized, zero-copy Polars/DuckDB pipeline with public code, archived DOIs and automated tests.</w:t>
       </w:r>
     </w:p>
     <w:p>
       <w:pPr>
         <w:pStyle w:val="FirstParagraph"/>
+      </w:pPr>
+      <w:r>
+        <w:t>The novelty is computational and infrastructural rather than algorithmic: D2 formalizes the target contract, gated inference defines the operational policy, and the software exposes that contract to other learners. The geoscientific contribution is a transferable, leakage-controlled benchmark: full FWI and INPE are tested under the same D2 protocol in the Gran Chaco, and the temporal versus spatial limits of the hybrid model are reported explicitly. The national case study is a testbed for data-scarce subtropical regions; we do not claim universal validity.</w:t>
+      </w:r>
+    </w:p>
+    <w:p>
+      <w:pPr>
+        <w:pStyle w:val="BodyText"/>
       </w:pPr>
       <w:r>
         <w:t>The remainder of the paper is organized as follows. Section 2 defines the D2 operator, the biophysical gate, the decoupled inference architecture and the evaluation harness. Section 3 reports selection on 2023 validation, the retrospective 2024–2025 test, the benchmark against FWI and INPE, the spatial and temporal generalization analyses and the operational utility. Section 4 discusses why canonical indices fail, what decoupling buys and where it fails, and the limitations of the study. Section 5 concludes.</w:t>
@@ -5948,7 +5961,16 @@
         <w:pStyle w:val="FirstParagraph"/>
       </w:pPr>
       <w:r>
-        <w:t>Full FWI and INPE are weak in both regions. The Chaco is moisture-limited and fuel-limited at the same time: fine fuels cure quickly under high VPD, but ignition depends on human access, pasture management and fire history. A single weather index cannot represent that interaction. The Canadian FWI was originally designed for boreal conifer stands, and two of its three fuel-moisture codes (the Duff Moisture Code and the Drought Code) explicitly model the slow drying and rain recharge of loosely and deeply compacted organic layers over days to weeks. In the semi-arid Chaco, the load-bearing fuels are fine grassy and shrub fuels that respond within hours to atmospheric demand, while the spatial pattern of ignition is governed by land-management and access-related sources. A purely meteorological index therefore carries no information about where those anthropogenic ignition sources are located, and its ranking skill collapses toward chance under a decoupled D2 evaluation. In the Oriental Region, the signal is more anthropogenic and less dependent on same-day weather. These results do not imply that FWI or INPE are useless globally; they show that their transfer to this subtropical system is not supported by the retrospective test.</w:t>
+        <w:t>Full FWI and INPE are weak in both regions. The Chaco is moisture-limited and fuel-limited at the same time: fine fuels cure quickly under high VPD, but ignition depends on human access, pasture management and fire history. A single weather index cannot represent that interaction. The Canadian FWI was originally designed for boreal conifer stands, and two of its three fuel-moisture codes (the Duff Moisture Code and the Drought Code) explicitly model the slow drying and rain recharge of loosely and deeply compacted organic layers over days to weeks</w:t>
+      </w:r>
+      <w:r>
+        <w:t xml:space="preserve"> </w:t>
+      </w:r>
+      <w:r>
+        <w:t>(Flannigan et al., 2016; Van Wagner, 1987)</w:t>
+      </w:r>
+      <w:r>
+        <w:t>. In the semi-arid Chaco, the load-bearing fuels are fine grassy and shrub fuels that respond within hours to atmospheric demand, while the spatial pattern of ignition is governed by land-management and access-related sources. A purely meteorological index therefore carries no information about where those anthropogenic ignition sources are located, and its ranking skill collapses toward chance under a decoupled D2 evaluation. In the Oriental Region, the signal is more anthropogenic and less dependent on same-day weather. These results do not imply that FWI or INPE are useless globally; they show that their transfer to this subtropical system is not supported by the retrospective test.</w:t>
       </w:r>
     </w:p>
     <w:p>
@@ -5956,7 +5978,7 @@
         <w:pStyle w:val="BodyText"/>
       </w:pPr>
       <w:r>
-        <w:t>The regional asymmetry is informative. In the Chaco, the dominant land-cover contrast is between dry forest, pastures and natural grasslands; fire is often a management tool in a matrix with high fuel connectivity. In the Oriental Region, the landscape is wetter and more fragmented, and ignition is tightly coupled to roads, farms and the agricultural calendar. The same hybrid architecture therefore operates under different causal regimes, and the SHAP rankings reflect that difference: dry-forest fraction is important in the Chaco, while local anthropic concentration is more important in Oriental. A model with a single set of regional weights would blur this contrast.</w:t>
+        <w:t>The regional asymmetry is informative. In the Chaco, the dominant land-cover contrast is between dry forest, pastures and natural grasslands; fire is often a management tool in a matrix with high fuel connectivity. In the Oriental Region, the landscape is wetter and more fragmented, and ignition is tightly coupled to roads, farms and the agricultural calendar. The same hybrid architecture therefore operates under different pyrogeographic regimes, and the SHAP rankings reflect that difference: dry-forest fraction is important in the Chaco, while local anthropic concentration is more important in Oriental. A model with a single set of regional weights would blur this contrast.</w:t>
       </w:r>
     </w:p>
     <w:p>
@@ -5990,7 +6012,17 @@
         <w:pStyle w:val="BodyText"/>
       </w:pPr>
       <w:r>
-        <w:t>The D2 operator is also a guard against leakage. Without it, a model can mix persistence and ignition and obtain impressive but non-operational metrics. The combination of D2, a no-t-1 ignition layer and a spatial block holdout is the main methodological contribution. It also explains why a single aggregate score is not enough: the same model can be strong on held-in cells, weak on held-out blocks and weak at population prevalence, and each of these results answers a different question. Reporting the three views separately is more informative than selecting the most favorable one.</w:t>
+        <w:t>The D2 operator is also a guard against leakage. Without it, a model can mix persistence and ignition and obtain impressive but non-operational metrics. The combination of D2, a no-</w:t>
+      </w:r>
+      <w:r>
+        <w:rPr>
+          <w:i/>
+          <w:iCs/>
+        </w:rPr>
+        <w:t>t</w:t>
+      </w:r>
+      <w:r>
+        <w:t>−1 ignition layer and a spatial block holdout is the main methodological contribution. It also explains why a single aggregate score is not enough: the same model can be strong on held-in cells, weak on held-out blocks and weak at population prevalence, and each of these results answers a different question. Reporting the three views separately is more informative than selecting the most favorable one.</w:t>
       </w:r>
     </w:p>
     <w:p>
@@ -6014,7 +6046,20 @@
         <w:pStyle w:val="BodyText"/>
       </w:pPr>
       <w:r>
-        <w:t>A second lesson is that benchmark design changes the conclusion. If the test had been a random split, M3 would have looked stronger; if the ignition layer had included t-1 fire density, it would have looked stronger still. The spatial block and D2 target make those shortcuts visible. This is why the negative result is not a weakness of the paper but part of its contribution: it gives future work a clear baseline to beat without leakage.</w:t>
+        <w:t>A second lesson is that benchmark design changes the conclusion. If the test had been a random split, M3 would have looked stronger; if the ignition layer had included</w:t>
+      </w:r>
+      <w:r>
+        <w:t xml:space="preserve"> </w:t>
+      </w:r>
+      <w:r>
+        <w:rPr>
+          <w:i/>
+          <w:iCs/>
+        </w:rPr>
+        <w:t>t</w:t>
+      </w:r>
+      <w:r>
+        <w:t>−1 fire density, it would have looked stronger still. The spatial block and D2 target make those shortcuts visible. This is why the negative result is not a weakness of the paper but part of its contribution: it gives future work a clear baseline to beat without leakage.</w:t>
       </w:r>
     </w:p>
     <w:bookmarkEnd w:id="47"/>
@@ -6032,7 +6077,7 @@
         <w:pStyle w:val="FirstParagraph"/>
       </w:pPr>
       <w:r>
-        <w:t>The framework suggests a practical division of labor for geoscientific machine learning. The learner can be replaced; the target operator, the leakage controls and the evaluation harness should not. In this sense, the contribution is a computational protocol and software infrastructure, not a new learner. That distinction matters for C&amp;G because it makes the contribution reusable beyond Paraguay: another team can keep the D2 logic, substitute local fuel and weather layers, and compare its model on the same kind of retrospective test.</w:t>
+        <w:t>The framework suggests a practical division of labor for geoscientific machine learning. The learner can be replaced; the target operator, the leakage controls and the evaluation harness should not. In this sense, the contribution is a computational protocol and software infrastructure, not a new learner. That distinction matters for computational geoscience because it makes the contribution reusable beyond Paraguay: another team can keep the D2 logic, substitute local fuel and weather layers, and compare its model on the same kind of retrospective test.</w:t>
       </w:r>
     </w:p>
     <w:p>
@@ -6051,6 +6096,14 @@
       </w:pPr>
       <w:r>
         <w:t>4.4 Limitations</w:t>
+      </w:r>
+    </w:p>
+    <w:p>
+      <w:pPr>
+        <w:pStyle w:val="FirstParagraph"/>
+      </w:pPr>
+      <w:r>
+        <w:t>Several limitations bound the interpretation of this study:</w:t>
       </w:r>
     </w:p>
     <w:p>
@@ -6062,7 +6115,17 @@
         </w:numPr>
       </w:pPr>
       <w:r>
-        <w:t>The study covers one country and two macro-regions; external validation is still missing.</w:t>
+        <w:rPr>
+          <w:b/>
+          <w:bCs/>
+        </w:rPr>
+        <w:t>Data and observational constraints.</w:t>
+      </w:r>
+      <w:r>
+        <w:t xml:space="preserve"> </w:t>
+      </w:r>
+      <w:r>
+        <w:t>The study covers one country and two macro-regions without external-country validation. Fuel characterization relies on the annual MapBiomas Collection 2 series (2017–2023) joined by prior year, so 2024 uses the 2023 map with a one-year lag and 2025 extrapolates it with a two-year lag. Active-fire targets depend on VIIRS detections, which can miss sub-canopy or cloud-obscured fires in the absence of an explicit observation model, while ERA5-Land inputs (0.25°, 3-hourly) may smooth local intra-day VPD and wind peaks.</w:t>
       </w:r>
     </w:p>
     <w:p>
@@ -6074,7 +6137,30 @@
         </w:numPr>
       </w:pPr>
       <w:r>
-        <w:t>Fuel is an annual MapBiomas Collection 2 series (2017–2023) joined by prior year; 2024 uses the 2023 map with lag 1 and 2025 reuses 2023 with lag 2, so the 2025 fuel state is extrapolated.</w:t>
+        <w:rPr>
+          <w:b/>
+          <w:bCs/>
+        </w:rPr>
+        <w:t>Statistical and generalization limits.</w:t>
+      </w:r>
+      <w:r>
+        <w:t xml:space="preserve"> </w:t>
+      </w:r>
+      <w:r>
+        <w:t>Although D2 sensitivity across 15/25/35-km radii and 7/10/14-day windows confirmed that model rankings are stable under full retraining (Supplementary Table S20), the 2024–2025 test is retrospective rather than blind and shares 90.65 % of its active cells with the training period through temporal overlap. M3 loses its predictive advantage in unseen spatial blocks, which requires M2 as the operational fallback while M1 remains an insufficient baseline; conformal coverage (90.17 %/90.31 % at the 90 % level) is empirical rather than formally guaranteed under temporal shift; and the coupled</w:t>
+      </w:r>
+      <w:r>
+        <w:t xml:space="preserve"> </w:t>
+      </w:r>
+      <w:r>
+        <w:rPr>
+          <w:i/>
+          <w:iCs/>
+        </w:rPr>
+        <w:t>t</w:t>
+      </w:r>
+      <w:r>
+        <w:t>−1 comparator (Supplementary Table S19) was evaluated on the same gated case-control sample, so it does not test removal of the biophysical gate.</w:t>
       </w:r>
     </w:p>
     <w:p>
@@ -6086,151 +6172,30 @@
         </w:numPr>
       </w:pPr>
       <w:r>
-        <w:t>VIIRS can miss fires under clouds; no explicit observation model is implemented.</w:t>
-      </w:r>
-    </w:p>
-    <w:p>
-      <w:pPr>
-        <w:pStyle w:val="Compact"/>
-        <w:numPr>
-          <w:ilvl w:val="0"/>
-          <w:numId w:val="1004"/>
-        </w:numPr>
-      </w:pPr>
-      <w:r>
-        <w:t>ERA5-Land is used at 0.25° and 3-hourly resolution; intra-day VPD and wind peaks may be underestimated.</w:t>
-      </w:r>
-    </w:p>
-    <w:p>
-      <w:pPr>
-        <w:pStyle w:val="Compact"/>
-        <w:numPr>
-          <w:ilvl w:val="0"/>
-          <w:numId w:val="1004"/>
-        </w:numPr>
-      </w:pPr>
-      <w:r>
-        <w:t>Population-level ignition precision is very low (0.082 %/0.198 %), and cost-loss does not show a clear M3 advantage over M2.</w:t>
-      </w:r>
-    </w:p>
-    <w:p>
-      <w:pPr>
-        <w:pStyle w:val="Compact"/>
-        <w:numPr>
-          <w:ilvl w:val="0"/>
-          <w:numId w:val="1004"/>
-        </w:numPr>
-      </w:pPr>
-      <w:r>
-        <w:t>M3 loses spatial transferability; M2 is the operational fallback and M1 is a baseline. M1 should not be presented as a solution for new cells.</w:t>
-      </w:r>
-    </w:p>
-    <w:p>
-      <w:pPr>
-        <w:pStyle w:val="Compact"/>
-        <w:numPr>
-          <w:ilvl w:val="0"/>
-          <w:numId w:val="1004"/>
-        </w:numPr>
-      </w:pPr>
-      <w:r>
-        <w:t>The system is a nowcast/hindcast; a day-ahead forecast requires numerical weather prediction.</w:t>
-      </w:r>
-    </w:p>
-    <w:p>
-      <w:pPr>
-        <w:pStyle w:val="Compact"/>
-        <w:numPr>
-          <w:ilvl w:val="0"/>
-          <w:numId w:val="1004"/>
-        </w:numPr>
-      </w:pPr>
-      <w:r>
-        <w:t>Conformal coverage is empirical and does not guarantee performance under temporal shift.</w:t>
-      </w:r>
-    </w:p>
-    <w:p>
-      <w:pPr>
-        <w:pStyle w:val="Compact"/>
-        <w:numPr>
-          <w:ilvl w:val="0"/>
-          <w:numId w:val="1004"/>
-        </w:numPr>
-      </w:pPr>
-      <w:r>
-        <w:t>A coupled t-1 baseline was implemented on the combined gated sample and did not materially outperform the decoupled task architecture (Table S19); because it uses the same gated sample, it does not test removal of gating.</w:t>
-      </w:r>
-    </w:p>
-    <w:p>
-      <w:pPr>
-        <w:pStyle w:val="Compact"/>
-        <w:numPr>
-          <w:ilvl w:val="0"/>
-          <w:numId w:val="1004"/>
-        </w:numPr>
-      </w:pPr>
-      <w:r>
-        <w:t>The model has not been tested prospectively with an operational agency; the cost-loss and alert-map results are retrospective.</w:t>
-      </w:r>
-    </w:p>
-    <w:p>
-      <w:pPr>
-        <w:pStyle w:val="Compact"/>
-        <w:numPr>
-          <w:ilvl w:val="0"/>
-          <w:numId w:val="1004"/>
-        </w:numPr>
-      </w:pPr>
-      <w:r>
-        <w:t>The national grid and priors are tailored to Paraguay; transfer to another country would require rebuilding the grid, the historical priors and the prevalence metadata.</w:t>
-      </w:r>
-    </w:p>
-    <w:p>
-      <w:pPr>
-        <w:pStyle w:val="Compact"/>
-        <w:numPr>
-          <w:ilvl w:val="0"/>
-          <w:numId w:val="1004"/>
-        </w:numPr>
-      </w:pPr>
-      <w:r>
-        <w:t>The 10-day same-cell exclusion was retained as the operational default; the 7/10/14-d windows and 15/25/35-km radii were re-estimated with full retraining and did not change the model ranking (Table S20).</w:t>
-      </w:r>
-    </w:p>
-    <w:p>
-      <w:pPr>
-        <w:pStyle w:val="Compact"/>
-        <w:numPr>
-          <w:ilvl w:val="0"/>
-          <w:numId w:val="1004"/>
-        </w:numPr>
-      </w:pPr>
-      <w:r>
-        <w:t>The 2024–2025 test is retrospective, not blind: it was already observed during development. About 90.65 % of test cells also appear in training because of temporal overlap, which limits interpretation as spatial generalization.</w:t>
-      </w:r>
-    </w:p>
-    <w:p>
-      <w:pPr>
-        <w:pStyle w:val="Compact"/>
-        <w:numPr>
-          <w:ilvl w:val="0"/>
-          <w:numId w:val="1004"/>
-        </w:numPr>
-      </w:pPr>
-      <w:r>
-        <w:t>The dependency lock has exact versions but not wheel hashes; the exception is documented in</w:t>
-      </w:r>
-      <w:r>
-        <w:t xml:space="preserve"> </w:t>
-      </w:r>
-      <w:r>
-        <w:rPr>
-          <w:rStyle w:val="VerbatimChar"/>
-        </w:rPr>
-        <w:t>auditoria/FASE2_0_LOCK_EXCEPTION.md</w:t>
-      </w:r>
-      <w:r>
-        <w:t>.</w:t>
+        <w:rPr>
+          <w:b/>
+          <w:bCs/>
+        </w:rPr>
+        <w:t>Operational and software scope.</w:t>
+      </w:r>
+      <w:r>
+        <w:t xml:space="preserve"> </w:t>
+      </w:r>
+      <w:r>
+        <w:t>Because the pipeline uses observed meteorology up to day</w:t>
+      </w:r>
+      <w:r>
+        <w:t xml:space="preserve"> </w:t>
+      </w:r>
+      <w:r>
+        <w:rPr>
+          <w:i/>
+          <w:iCs/>
+        </w:rPr>
+        <w:t>t</w:t>
+      </w:r>
+      <w:r>
+        <w:t>, it functions as a nowcast/hindcast rather than a day-ahead forecast supported by numerical weather prediction. Population-level ignition precision is very low (0.082 %/0.198 %), cost-loss shows no clear M3 advantage over M2 for ignition, and the alert layers have not yet been evaluated prospectively with an operational agency. Finally, transferring the pipeline to another country would require rebuilding the 1-km² grid, the historical priors and the prevalence metadata, and the pinned dependency lock records exact package versions without platform-specific wheel hashes (documented in the code repository).</w:t>
       </w:r>
     </w:p>
     <w:bookmarkEnd w:id="49"/>
@@ -6249,7 +6214,20 @@
         <w:pStyle w:val="FirstParagraph"/>
       </w:pPr>
       <w:r>
-        <w:t>We presented a reproducible computational framework for decoupled wildfire ignition and propagation benchmarking. D2 separates ignition from persistence; the M3/M2 architecture provides a temporal nowcast with a more robust spatial fallback; and the open harness makes the benchmark auditable. Selection used 2023 validation: M3 reached area under the receiver operating characteristic curve (ROC-AUC) 0.7844/0.7628 and M2 was best in spatial blocks (0.6773/0.7470). On the retrospective 2024–2025 test, M3 reaches 0.8021/0.7534 against 0.5173/0.5564 for full FWI and 0.5389/0.4990 for INPE, but population precision is low and the hybrid advantage does not transfer spatially. M1 is not defensible as the fallback; M2 replaces it and M3 is presented as a recurrence-aware nowcast rather than a universal ignition model. The most useful output is not a single map: it is a protocol that shows where a model is valid, where it fails and how to reproduce the result. A coupled t-1 comparator is reported in Supplementary Table S19, and the independent confirmation holdout is reported in Table S18. Future work should add external-country validation and a day-ahead weather source. Code and data are archived under the concept DOIs reported below, and the benchmark can be extended to other subtropical regions without changing the target logic.</w:t>
+        <w:t>We presented a reproducible computational framework for decoupled wildfire ignition and propagation benchmarking in the Gran Chaco and Oriental Region of Paraguay. The D2 target operator separates primary ignition from multi-day persistence, the gated M3/M2 architecture pairs a recurrence-aware temporal nowcast with a spatially robust fallback, and the evaluation harness makes every comparison auditable. On 2023 validation, M3 reached a ROC-AUC of 0.7844/0.7628 (Chaco/Oriental), whereas M2 proved most robust across both development (0.6773/0.7470) and independent confirmation spatial blocks (0.6871/0.6621; Supplementary Table S18), justifying the replacement of the biophysical baseline M1 as the operational fallback. On the retrospective 2024–2025 test, M3 substantially outperformed the full Canadian FWI (0.8021/0.7534 vs. 0.5173/0.5564) and the INPE Risco de Fogo (0.5389/0.4990), and decoupling did not sacrifice discrimination relative to a coupled</w:t>
+      </w:r>
+      <w:r>
+        <w:t xml:space="preserve"> </w:t>
+      </w:r>
+      <w:r>
+        <w:rPr>
+          <w:i/>
+          <w:iCs/>
+        </w:rPr>
+        <w:t>t</w:t>
+      </w:r>
+      <w:r>
+        <w:t>−1 baseline (Supplementary Table S19). Nevertheless, population-level ignition precision remains low (0.082 %/0.198 %) and the hybrid advantage is strictly temporal rather than spatial, positioning the system as an operational screening and prioritization tool rather than a stand-alone warning system. Ultimately, the main contribution of this work is not a single susceptibility map but an open, auditable protocol—archived with public code and data—that shows where a geoscientific model holds, where it fails and how to extend the benchmark to other subtropical regions and to day-ahead weather forecasts.</w:t>
       </w:r>
     </w:p>
     <w:bookmarkEnd w:id="51"/>
@@ -6409,7 +6387,7 @@
       </w:r>
     </w:p>
     <w:bookmarkEnd w:id="58"/>
-    <w:bookmarkStart w:id="109" w:name="references"/>
+    <w:bookmarkStart w:id="111" w:name="references"/>
     <w:p>
       <w:pPr>
         <w:pStyle w:val="Heading1"/>
@@ -6418,7 +6396,7 @@
         <w:t>References</w:t>
       </w:r>
     </w:p>
-    <w:bookmarkStart w:id="108" w:name="refs"/>
+    <w:bookmarkStart w:id="110" w:name="refs"/>
     <w:bookmarkStart w:id="60" w:name="ref-alvarado2018"/>
     <w:p>
       <w:pPr>
@@ -6654,12 +6632,59 @@
       </w:hyperlink>
     </w:p>
     <w:bookmarkEnd w:id="68"/>
-    <w:bookmarkStart w:id="70" w:name="ref-hansen2013"/>
+    <w:bookmarkStart w:id="70" w:name="ref-flannigan2016"/>
     <w:p>
       <w:pPr>
         <w:pStyle w:val="Bibliography"/>
       </w:pPr>
       <w:r>
+        <w:t>Flannigan, M. D., Wotton, B. M., Marshall, G. A., de Groot, W. J., Johnston, J., Jurko, N., &amp; Cantin, A. S. (2016). Fuel moisture sensitivity to temperature and precipitation: Climate change implications.</w:t>
+      </w:r>
+      <w:r>
+        <w:t xml:space="preserve"> </w:t>
+      </w:r>
+      <w:r>
+        <w:rPr>
+          <w:i/>
+          <w:iCs/>
+        </w:rPr>
+        <w:t>Climatic Change</w:t>
+      </w:r>
+      <w:r>
+        <w:t>,</w:t>
+      </w:r>
+      <w:r>
+        <w:t xml:space="preserve"> </w:t>
+      </w:r>
+      <w:r>
+        <w:rPr>
+          <w:i/>
+          <w:iCs/>
+        </w:rPr>
+        <w:t>134</w:t>
+      </w:r>
+      <w:r>
+        <w:t>(1), 59–71.</w:t>
+      </w:r>
+      <w:r>
+        <w:t xml:space="preserve"> </w:t>
+      </w:r>
+      <w:hyperlink r:id="rId69">
+        <w:r>
+          <w:rPr>
+            <w:rStyle w:val="Hyperlink"/>
+          </w:rPr>
+          <w:t xml:space="preserve">https://doi.org/10.1007/s10584-015-1521-0</w:t>
+        </w:r>
+      </w:hyperlink>
+    </w:p>
+    <w:bookmarkEnd w:id="70"/>
+    <w:bookmarkStart w:id="72" w:name="ref-hansen2013"/>
+    <w:p>
+      <w:pPr>
+        <w:pStyle w:val="Bibliography"/>
+      </w:pPr>
+      <w:r>
         <w:t>Hansen, M. C., Potapov, P. V., Moore, R., Hancher, M., Turubanova, S. A., Tyukavina, A., Thau, D., Stehman, S. V., Goetz, S. J., Loveland, T. R., Kommareddy, A., Egorov, A., Chini, L., Justice, C. O., &amp; Townshend, J. R. G. (2013). High-resolution global maps of 21st-century forest cover change.</w:t>
       </w:r>
       <w:r>
@@ -6691,7 +6716,7 @@
       <w:r>
         <w:t xml:space="preserve"> </w:t>
       </w:r>
-      <w:hyperlink r:id="rId69">
+      <w:hyperlink r:id="rId71">
         <w:r>
           <w:rPr>
             <w:rStyle w:val="Hyperlink"/>
@@ -6700,8 +6725,8 @@
         </w:r>
       </w:hyperlink>
     </w:p>
-    <w:bookmarkEnd w:id="70"/>
-    <w:bookmarkStart w:id="72" w:name="ref-jain2020review"/>
+    <w:bookmarkEnd w:id="72"/>
+    <w:bookmarkStart w:id="74" w:name="ref-jain2020review"/>
     <w:p>
       <w:pPr>
         <w:pStyle w:val="Bibliography"/>
@@ -6738,7 +6763,7 @@
       <w:r>
         <w:t xml:space="preserve"> </w:t>
       </w:r>
-      <w:hyperlink r:id="rId71">
+      <w:hyperlink r:id="rId73">
         <w:r>
           <w:rPr>
             <w:rStyle w:val="Hyperlink"/>
@@ -6747,8 +6772,8 @@
         </w:r>
       </w:hyperlink>
     </w:p>
-    <w:bookmarkEnd w:id="72"/>
-    <w:bookmarkStart w:id="74" w:name="ref-jolly2015"/>
+    <w:bookmarkEnd w:id="74"/>
+    <w:bookmarkStart w:id="76" w:name="ref-jolly2015"/>
     <w:p>
       <w:pPr>
         <w:pStyle w:val="Bibliography"/>
@@ -6785,7 +6810,7 @@
       <w:r>
         <w:t xml:space="preserve"> </w:t>
       </w:r>
-      <w:hyperlink r:id="rId73">
+      <w:hyperlink r:id="rId75">
         <w:r>
           <w:rPr>
             <w:rStyle w:val="Hyperlink"/>
@@ -6794,8 +6819,8 @@
         </w:r>
       </w:hyperlink>
     </w:p>
-    <w:bookmarkEnd w:id="74"/>
-    <w:bookmarkStart w:id="75" w:name="ref-ke2017lightgbm"/>
+    <w:bookmarkEnd w:id="76"/>
+    <w:bookmarkStart w:id="77" w:name="ref-ke2017lightgbm"/>
     <w:p>
       <w:pPr>
         <w:pStyle w:val="Bibliography"/>
@@ -6830,8 +6855,8 @@
         <w:t>, 3146–3154.</w:t>
       </w:r>
     </w:p>
-    <w:bookmarkEnd w:id="75"/>
-    <w:bookmarkStart w:id="77" w:name="ref-legendre1993"/>
+    <w:bookmarkEnd w:id="77"/>
+    <w:bookmarkStart w:id="79" w:name="ref-legendre1993"/>
     <w:p>
       <w:pPr>
         <w:pStyle w:val="Bibliography"/>
@@ -6868,7 +6893,7 @@
       <w:r>
         <w:t xml:space="preserve"> </w:t>
       </w:r>
-      <w:hyperlink r:id="rId76">
+      <w:hyperlink r:id="rId78">
         <w:r>
           <w:rPr>
             <w:rStyle w:val="Hyperlink"/>
@@ -6877,8 +6902,8 @@
         </w:r>
       </w:hyperlink>
     </w:p>
-    <w:bookmarkEnd w:id="77"/>
-    <w:bookmarkStart w:id="79" w:name="ref-lundberg2020treeshap"/>
+    <w:bookmarkEnd w:id="79"/>
+    <w:bookmarkStart w:id="81" w:name="ref-lundberg2020treeshap"/>
     <w:p>
       <w:pPr>
         <w:pStyle w:val="Bibliography"/>
@@ -6927,7 +6952,7 @@
       <w:r>
         <w:t xml:space="preserve"> </w:t>
       </w:r>
-      <w:hyperlink r:id="rId78">
+      <w:hyperlink r:id="rId80">
         <w:r>
           <w:rPr>
             <w:rStyle w:val="Hyperlink"/>
@@ -6936,8 +6961,8 @@
         </w:r>
       </w:hyperlink>
     </w:p>
-    <w:bookmarkEnd w:id="79"/>
-    <w:bookmarkStart w:id="81" w:name="ref-mapbiomas2023"/>
+    <w:bookmarkEnd w:id="81"/>
+    <w:bookmarkStart w:id="83" w:name="ref-mapbiomas2023"/>
     <w:p>
       <w:pPr>
         <w:pStyle w:val="Bibliography"/>
@@ -6975,7 +7000,7 @@
       <w:r>
         <w:t xml:space="preserve"> </w:t>
       </w:r>
-      <w:hyperlink r:id="rId80">
+      <w:hyperlink r:id="rId82">
         <w:r>
           <w:rPr>
             <w:rStyle w:val="Hyperlink"/>
@@ -6987,8 +7012,8 @@
         <w:t>.</w:t>
       </w:r>
     </w:p>
-    <w:bookmarkEnd w:id="81"/>
-    <w:bookmarkStart w:id="83" w:name="ref-munoz2021era5land"/>
+    <w:bookmarkEnd w:id="83"/>
+    <w:bookmarkStart w:id="85" w:name="ref-munoz2021era5land"/>
     <w:p>
       <w:pPr>
         <w:pStyle w:val="Bibliography"/>
@@ -7034,7 +7059,7 @@
       <w:r>
         <w:t xml:space="preserve"> </w:t>
       </w:r>
-      <w:hyperlink r:id="rId82">
+      <w:hyperlink r:id="rId84">
         <w:r>
           <w:rPr>
             <w:rStyle w:val="Hyperlink"/>
@@ -7043,8 +7068,8 @@
         </w:r>
       </w:hyperlink>
     </w:p>
-    <w:bookmarkEnd w:id="83"/>
-    <w:bookmarkStart w:id="85" w:name="ref-niculescu2005"/>
+    <w:bookmarkEnd w:id="85"/>
+    <w:bookmarkStart w:id="87" w:name="ref-niculescu2005"/>
     <w:p>
       <w:pPr>
         <w:pStyle w:val="Bibliography"/>
@@ -7068,7 +7093,7 @@
       <w:r>
         <w:t xml:space="preserve"> </w:t>
       </w:r>
-      <w:hyperlink r:id="rId84">
+      <w:hyperlink r:id="rId86">
         <w:r>
           <w:rPr>
             <w:rStyle w:val="Hyperlink"/>
@@ -7077,8 +7102,8 @@
         </w:r>
       </w:hyperlink>
     </w:p>
-    <w:bookmarkEnd w:id="85"/>
-    <w:bookmarkStart w:id="87" w:name="ref-pivello2021"/>
+    <w:bookmarkEnd w:id="87"/>
+    <w:bookmarkStart w:id="89" w:name="ref-pivello2021"/>
     <w:p>
       <w:pPr>
         <w:pStyle w:val="Bibliography"/>
@@ -7115,7 +7140,7 @@
       <w:r>
         <w:t xml:space="preserve"> </w:t>
       </w:r>
-      <w:hyperlink r:id="rId86">
+      <w:hyperlink r:id="rId88">
         <w:r>
           <w:rPr>
             <w:rStyle w:val="Hyperlink"/>
@@ -7124,8 +7149,8 @@
         </w:r>
       </w:hyperlink>
     </w:p>
-    <w:bookmarkEnd w:id="87"/>
-    <w:bookmarkStart w:id="88" w:name="ref-platt1999"/>
+    <w:bookmarkEnd w:id="89"/>
+    <w:bookmarkStart w:id="90" w:name="ref-platt1999"/>
     <w:p>
       <w:pPr>
         <w:pStyle w:val="Bibliography"/>
@@ -7147,8 +7172,8 @@
         <w:t>, 61–74.</w:t>
       </w:r>
     </w:p>
-    <w:bookmarkEnd w:id="88"/>
-    <w:bookmarkStart w:id="90" w:name="ref-ploton2020"/>
+    <w:bookmarkEnd w:id="90"/>
+    <w:bookmarkStart w:id="92" w:name="ref-ploton2020"/>
     <w:p>
       <w:pPr>
         <w:pStyle w:val="Bibliography"/>
@@ -7185,7 +7210,7 @@
       <w:r>
         <w:t xml:space="preserve"> </w:t>
       </w:r>
-      <w:hyperlink r:id="rId89">
+      <w:hyperlink r:id="rId91">
         <w:r>
           <w:rPr>
             <w:rStyle w:val="Hyperlink"/>
@@ -7194,8 +7219,8 @@
         </w:r>
       </w:hyperlink>
     </w:p>
-    <w:bookmarkEnd w:id="90"/>
-    <w:bookmarkStart w:id="92" w:name="ref-raasveldt2019duckdb"/>
+    <w:bookmarkEnd w:id="92"/>
+    <w:bookmarkStart w:id="94" w:name="ref-raasveldt2019duckdb"/>
     <w:p>
       <w:pPr>
         <w:pStyle w:val="Bibliography"/>
@@ -7219,7 +7244,7 @@
       <w:r>
         <w:t xml:space="preserve"> </w:t>
       </w:r>
-      <w:hyperlink r:id="rId91">
+      <w:hyperlink r:id="rId93">
         <w:r>
           <w:rPr>
             <w:rStyle w:val="Hyperlink"/>
@@ -7228,8 +7253,8 @@
         </w:r>
       </w:hyperlink>
     </w:p>
-    <w:bookmarkEnd w:id="92"/>
-    <w:bookmarkStart w:id="94" w:name="ref-roberts2017"/>
+    <w:bookmarkEnd w:id="94"/>
+    <w:bookmarkStart w:id="96" w:name="ref-roberts2017"/>
     <w:p>
       <w:pPr>
         <w:pStyle w:val="Bibliography"/>
@@ -7266,7 +7291,7 @@
       <w:r>
         <w:t xml:space="preserve"> </w:t>
       </w:r>
-      <w:hyperlink r:id="rId93">
+      <w:hyperlink r:id="rId95">
         <w:r>
           <w:rPr>
             <w:rStyle w:val="Hyperlink"/>
@@ -7275,8 +7300,8 @@
         </w:r>
       </w:hyperlink>
     </w:p>
-    <w:bookmarkEnd w:id="94"/>
-    <w:bookmarkStart w:id="96" w:name="ref-sanmiguel2012"/>
+    <w:bookmarkEnd w:id="96"/>
+    <w:bookmarkStart w:id="98" w:name="ref-sanmiguel2012"/>
     <w:p>
       <w:pPr>
         <w:pStyle w:val="Bibliography"/>
@@ -7306,7 +7331,7 @@
       <w:r>
         <w:t xml:space="preserve"> </w:t>
       </w:r>
-      <w:hyperlink r:id="rId95">
+      <w:hyperlink r:id="rId97">
         <w:r>
           <w:rPr>
             <w:rStyle w:val="Hyperlink"/>
@@ -7315,8 +7340,8 @@
         </w:r>
       </w:hyperlink>
     </w:p>
-    <w:bookmarkEnd w:id="96"/>
-    <w:bookmarkStart w:id="98" w:name="ref-schroeder2014"/>
+    <w:bookmarkEnd w:id="98"/>
+    <w:bookmarkStart w:id="100" w:name="ref-schroeder2014"/>
     <w:p>
       <w:pPr>
         <w:pStyle w:val="Bibliography"/>
@@ -7365,7 +7390,7 @@
       <w:r>
         <w:t xml:space="preserve"> </w:t>
       </w:r>
-      <w:hyperlink r:id="rId97">
+      <w:hyperlink r:id="rId99">
         <w:r>
           <w:rPr>
             <w:rStyle w:val="Hyperlink"/>
@@ -7374,8 +7399,8 @@
         </w:r>
       </w:hyperlink>
     </w:p>
-    <w:bookmarkEnd w:id="98"/>
-    <w:bookmarkStart w:id="100" w:name="ref-setzer2019"/>
+    <w:bookmarkEnd w:id="100"/>
+    <w:bookmarkStart w:id="102" w:name="ref-setzer2019"/>
     <w:p>
       <w:pPr>
         <w:pStyle w:val="Bibliography"/>
@@ -7469,7 +7494,7 @@
       <w:r>
         <w:t xml:space="preserve"> </w:t>
       </w:r>
-      <w:hyperlink r:id="rId99">
+      <w:hyperlink r:id="rId101">
         <w:r>
           <w:rPr>
             <w:rStyle w:val="Hyperlink"/>
@@ -7478,8 +7503,8 @@
         </w:r>
       </w:hyperlink>
     </w:p>
-    <w:bookmarkEnd w:id="100"/>
-    <w:bookmarkStart w:id="102" w:name="ref-stocks1989"/>
+    <w:bookmarkEnd w:id="102"/>
+    <w:bookmarkStart w:id="104" w:name="ref-stocks1989"/>
     <w:p>
       <w:pPr>
         <w:pStyle w:val="Bibliography"/>
@@ -7516,7 +7541,7 @@
       <w:r>
         <w:t xml:space="preserve"> </w:t>
       </w:r>
-      <w:hyperlink r:id="rId101">
+      <w:hyperlink r:id="rId103">
         <w:r>
           <w:rPr>
             <w:rStyle w:val="Hyperlink"/>
@@ -7525,8 +7550,8 @@
         </w:r>
       </w:hyperlink>
     </w:p>
-    <w:bookmarkEnd w:id="102"/>
-    <w:bookmarkStart w:id="104" w:name="ref-tobler1970"/>
+    <w:bookmarkEnd w:id="104"/>
+    <w:bookmarkStart w:id="106" w:name="ref-tobler1970"/>
     <w:p>
       <w:pPr>
         <w:pStyle w:val="Bibliography"/>
@@ -7563,7 +7588,7 @@
       <w:r>
         <w:t xml:space="preserve"> </w:t>
       </w:r>
-      <w:hyperlink r:id="rId103">
+      <w:hyperlink r:id="rId105">
         <w:r>
           <w:rPr>
             <w:rStyle w:val="Hyperlink"/>
@@ -7572,8 +7597,8 @@
         </w:r>
       </w:hyperlink>
     </w:p>
-    <w:bookmarkEnd w:id="104"/>
-    <w:bookmarkStart w:id="106" w:name="ref-vallejos2015"/>
+    <w:bookmarkEnd w:id="106"/>
+    <w:bookmarkStart w:id="108" w:name="ref-vallejos2015"/>
     <w:p>
       <w:pPr>
         <w:pStyle w:val="Bibliography"/>
@@ -7610,7 +7635,7 @@
       <w:r>
         <w:t xml:space="preserve"> </w:t>
       </w:r>
-      <w:hyperlink r:id="rId105">
+      <w:hyperlink r:id="rId107">
         <w:r>
           <w:rPr>
             <w:rStyle w:val="Hyperlink"/>
@@ -7619,8 +7644,8 @@
         </w:r>
       </w:hyperlink>
     </w:p>
-    <w:bookmarkEnd w:id="106"/>
-    <w:bookmarkStart w:id="107" w:name="ref-vanwagner1987"/>
+    <w:bookmarkEnd w:id="108"/>
+    <w:bookmarkStart w:id="109" w:name="ref-vanwagner1987"/>
     <w:p>
       <w:pPr>
         <w:pStyle w:val="Bibliography"/>
@@ -7655,9 +7680,9 @@
         <w:t>, 1–37.</w:t>
       </w:r>
     </w:p>
-    <w:bookmarkEnd w:id="107"/>
-    <w:bookmarkEnd w:id="108"/>
     <w:bookmarkEnd w:id="109"/>
+    <w:bookmarkEnd w:id="110"/>
+    <w:bookmarkEnd w:id="111"/>
     <w:sectPr>
       <w:footerReference w:type="default" r:id="rId9"/>
       <w:footnotePr>
@@ -8025,34 +8050,7 @@
     </w:lvlOverride>
   </w:num>
   <w:num w:numId="1004">
-    <w:abstractNumId w:val="99411"/>
-    <w:lvlOverride w:ilvl="0">
-      <w:startOverride w:val="1"/>
-    </w:lvlOverride>
-    <w:lvlOverride w:ilvl="1">
-      <w:startOverride w:val="1"/>
-    </w:lvlOverride>
-    <w:lvlOverride w:ilvl="2">
-      <w:startOverride w:val="1"/>
-    </w:lvlOverride>
-    <w:lvlOverride w:ilvl="3">
-      <w:startOverride w:val="1"/>
-    </w:lvlOverride>
-    <w:lvlOverride w:ilvl="4">
-      <w:startOverride w:val="1"/>
-    </w:lvlOverride>
-    <w:lvlOverride w:ilvl="5">
-      <w:startOverride w:val="1"/>
-    </w:lvlOverride>
-    <w:lvlOverride w:ilvl="6">
-      <w:startOverride w:val="1"/>
-    </w:lvlOverride>
-    <w:lvlOverride w:ilvl="7">
-      <w:startOverride w:val="1"/>
-    </w:lvlOverride>
-    <w:lvlOverride w:ilvl="8">
-      <w:startOverride w:val="1"/>
-    </w:lvlOverride>
+    <w:abstractNumId w:val="991"/>
   </w:num>
 </w:numbering>
 </file>

</xml_diff>

<commit_message>
refactor(repo): aplica estructura canonica y publica simetria de umbral FWI/INPE
- Reorganiza fuentes a manuscrito/{assets,en,es} y artefactos a
  entregables/{figuras,tablas}; actualiza rutas, CI, README y documentacion.
- B.1: la Tabla 3 y la Tabla S11 (EN/ES) reportan Cutoff, Precision, Recall y
  F0.5 para FWI e INPE, con la regla F0.5 simetrica declarada y los cortes
  congelados para el test retrospectivo.
- Aclara las escalas de los indices (FWI canadiense vs INPE 0-1) y que ninguno
  recibio calibracion local.
- Agrega preset de anchos de 10 columnas al formateador DOCX.
- Agrega docs/plan_mejoras_benchmark_decision.md con el plan B/C.
- Regenera DOCX/HTML de manuscrito y suplementarios en EN y ES.
- Restaura title_page.qmd, cover_letter.qmd y highlights.md, que el
  reordenamiento habia eliminado sin reubicarlos; corrige la ruta de la
  figura del resumen grafico.
</commit_message>
<xml_diff>
--- a/entregables/manuscrito.docx
+++ b/entregables/manuscrito.docx
@@ -888,7 +888,7 @@
                     <a:graphicData uri="http://schemas.openxmlformats.org/drawingml/2006/picture">
                       <pic:pic>
                         <pic:nvPicPr>
-                          <pic:cNvPr descr="figuras/fig01_framework_conceptual.png" id="14" name="Picture"/>
+                          <pic:cNvPr descr="../../entregables/figuras/fig01_framework_conceptual.png" id="14" name="Picture"/>
                           <pic:cNvPicPr>
                             <a:picLocks noChangeArrowheads="1" noChangeAspect="1"/>
                           </pic:cNvPicPr>
@@ -1224,7 +1224,7 @@
                     <a:graphicData uri="http://schemas.openxmlformats.org/drawingml/2006/picture">
                       <pic:pic>
                         <pic:nvPicPr>
-                          <pic:cNvPr descr="figuras/fig01_macro_regiones_cobertura.png" id="20" name="Picture"/>
+                          <pic:cNvPr descr="../../entregables/figuras/fig01_macro_regiones_cobertura.png" id="20" name="Picture"/>
                           <pic:cNvPicPr>
                             <a:picLocks noChangeArrowheads="1" noChangeAspect="1"/>
                           </pic:cNvPicPr>
@@ -3523,7 +3523,7 @@
                     <a:graphicData uri="http://schemas.openxmlformats.org/drawingml/2006/picture">
                       <pic:pic>
                         <pic:nvPicPr>
-                          <pic:cNvPr descr="figuras/fig02_curvas_roc_pr_test.png" id="28" name="Picture"/>
+                          <pic:cNvPr descr="../../entregables/figuras/fig02_curvas_roc_pr_test.png" id="28" name="Picture"/>
                           <pic:cNvPicPr>
                             <a:picLocks noChangeArrowheads="1" noChangeAspect="1"/>
                           </pic:cNvPicPr>
@@ -3603,7 +3603,19 @@
         <w:t xml:space="preserve"> </w:t>
       </w:r>
       <w:r>
-        <w:t>compares M3 with full FWI and INPE on the same retrospective test. M3 exceeds FWI by ΔROC = +0.2848 in Chaco and +0.1970 in Oriental, and INPE by +0.2633 and +0.2544. All paired comparisons have p ≤ 0.001 with B = 1 000. The full benchmark, including M2 and propagation rows, is in Supplementary Table S11; the complete significance table is in Supplementary Table S7.</w:t>
+        <w:t>compares M3 with full FWI and INPE on the same retrospective test. M3 exceeds FWI by ΔROC = +0.2848 in Chaco and +0.1970 in Oriental, and INPE by +0.2633 and +0.2544. All paired comparisons have p ≤ 0.001 with B = 1 000. To keep the comparison symmetric, the FWI and INPE operating points were selected on the same 2023 validation split with the identical F0.5 rule applied to the models and then frozen for the retrospective test (</w:t>
+      </w:r>
+      <w:hyperlink w:anchor="tbl-benchmark">
+        <w:r>
+          <w:rPr>
+            <w:rStyle w:val="Hyperlink"/>
+            <w:color w:val="000000"/>
+          </w:rPr>
+          <w:t xml:space="preserve">Table 3</w:t>
+        </w:r>
+      </w:hyperlink>
+      <w:r>
+        <w:t>); the resulting cutoffs are 0.3029 and 0.8963 in Chaco and 2.1509 and 0.0750 in Oriental for FWI and INPE, respectively. The full benchmark, including M2 and propagation rows, is in Supplementary Table S11; the complete significance table is in Supplementary Table S7.</w:t>
       </w:r>
     </w:p>
     <w:tbl>
@@ -3634,7 +3646,7 @@
                 <w:color w:val="000000"/>
                 <w:sz w:val="20"/>
               </w:rPr>
-              <w:t>Table 3: Benchmark on the retrospective 2024–2025 test. ΔROC is M3 minus the reference. FWI and INPE are normalized indices, not calibrated probabilities. Dashes (—) indicate reference models or comparisons not evaluated by construction. The full table is Supplementary Table S11.</w:t>
+              <w:t>Table 3: Benchmark on the retrospective 2024–2025 test. ΔROC is M3 minus the reference. Cutoffs for every row, including FWI and INPE, were selected on 2023 validation by maximizing F0.5 and then frozen for 2024–2025; precision and recall are case-control at that cutoff. FWI is on the Canadian index scale and INPE on a 0–1 risk scale, so cutoffs are not comparable across indices. Dashes (—) indicate reference models or comparisons not evaluated by construction. The full table is Supplementary Table S11.</w:t>
             </w:r>
           </w:p>
           <w:tbl>
@@ -3653,12 +3665,16 @@
               <w:tblLook w:firstRow="1" w:lastRow="0" w:firstColumn="0" w:lastColumn="0" w:noHBand="0" w:noVBand="0" w:val="0020"/>
             </w:tblPr>
             <w:tblGrid>
-              <w:gridCol w:w="1440"/>
-              <w:gridCol w:w="2016"/>
-              <w:gridCol w:w="1440"/>
-              <w:gridCol w:w="1152"/>
-              <w:gridCol w:w="1440"/>
-              <w:gridCol w:w="1872"/>
+              <w:gridCol w:w="936"/>
+              <w:gridCol w:w="2146"/>
+              <w:gridCol w:w="835"/>
+              <w:gridCol w:w="749"/>
+              <w:gridCol w:w="893"/>
+              <w:gridCol w:w="691"/>
+              <w:gridCol w:w="835"/>
+              <w:gridCol w:w="835"/>
+              <w:gridCol w:w="749"/>
+              <w:gridCol w:w="691"/>
             </w:tblGrid>
             <w:tr>
               <w:trPr>
@@ -3667,7 +3683,7 @@
               </w:trPr>
               <w:tc>
                 <w:tcPr>
-                  <w:tcW w:w="1440" w:type="dxa"/>
+                  <w:tcW w:w="936" w:type="dxa"/>
                 </w:tcPr>
                 <w:p>
                   <w:pPr>
@@ -3689,7 +3705,7 @@
               </w:tc>
               <w:tc>
                 <w:tcPr>
-                  <w:tcW w:w="2016" w:type="dxa"/>
+                  <w:tcW w:w="2146" w:type="dxa"/>
                 </w:tcPr>
                 <w:p>
                   <w:pPr>
@@ -3711,7 +3727,7 @@
               </w:tc>
               <w:tc>
                 <w:tcPr>
-                  <w:tcW w:w="1440" w:type="dxa"/>
+                  <w:tcW w:w="835" w:type="dxa"/>
                 </w:tcPr>
                 <w:p>
                   <w:pPr>
@@ -3733,7 +3749,7 @@
               </w:tc>
               <w:tc>
                 <w:tcPr>
-                  <w:tcW w:w="1152" w:type="dxa"/>
+                  <w:tcW w:w="749" w:type="dxa"/>
                 </w:tcPr>
                 <w:p>
                   <w:pPr>
@@ -3755,7 +3771,7 @@
               </w:tc>
               <w:tc>
                 <w:tcPr>
-                  <w:tcW w:w="1440" w:type="dxa"/>
+                  <w:tcW w:w="893" w:type="dxa"/>
                 </w:tcPr>
                 <w:p>
                   <w:pPr>
@@ -3777,7 +3793,7 @@
               </w:tc>
               <w:tc>
                 <w:tcPr>
-                  <w:tcW w:w="1872" w:type="dxa"/>
+                  <w:tcW w:w="691" w:type="dxa"/>
                 </w:tcPr>
                 <w:p>
                   <w:pPr>
@@ -3794,6 +3810,94 @@
                       <w:sz w:val="18"/>
                     </w:rPr>
                     <w:t>p</w:t>
+                  </w:r>
+                </w:p>
+              </w:tc>
+              <w:tc>
+                <w:tcPr>
+                  <w:tcW w:w="835" w:type="dxa"/>
+                </w:tcPr>
+                <w:p>
+                  <w:pPr>
+                    <w:pStyle w:val="Compact"/>
+                    <w:spacing w:line="240" w:lineRule="auto" w:before="0" w:after="0"/>
+                    <w:jc w:val="right"/>
+                    <w:jc w:val="center"/>
+                  </w:pPr>
+                  <w:r>
+                    <w:rPr>
+                      <w:rFonts w:ascii="Times New Roman" w:hAnsi="Times New Roman" w:cs="Times New Roman" w:eastAsia="Times New Roman"/>
+                      <w:b/>
+                      <w:color w:val="000000"/>
+                      <w:sz w:val="18"/>
+                    </w:rPr>
+                    <w:t>Cutoff</w:t>
+                  </w:r>
+                </w:p>
+              </w:tc>
+              <w:tc>
+                <w:tcPr>
+                  <w:tcW w:w="835" w:type="dxa"/>
+                </w:tcPr>
+                <w:p>
+                  <w:pPr>
+                    <w:pStyle w:val="Compact"/>
+                    <w:spacing w:line="240" w:lineRule="auto" w:before="0" w:after="0"/>
+                    <w:jc w:val="right"/>
+                    <w:jc w:val="center"/>
+                  </w:pPr>
+                  <w:r>
+                    <w:rPr>
+                      <w:rFonts w:ascii="Times New Roman" w:hAnsi="Times New Roman" w:cs="Times New Roman" w:eastAsia="Times New Roman"/>
+                      <w:b/>
+                      <w:color w:val="000000"/>
+                      <w:sz w:val="18"/>
+                    </w:rPr>
+                    <w:t>Prec. (%)</w:t>
+                  </w:r>
+                </w:p>
+              </w:tc>
+              <w:tc>
+                <w:tcPr>
+                  <w:tcW w:w="749" w:type="dxa"/>
+                </w:tcPr>
+                <w:p>
+                  <w:pPr>
+                    <w:pStyle w:val="Compact"/>
+                    <w:spacing w:line="240" w:lineRule="auto" w:before="0" w:after="0"/>
+                    <w:jc w:val="right"/>
+                    <w:jc w:val="center"/>
+                  </w:pPr>
+                  <w:r>
+                    <w:rPr>
+                      <w:rFonts w:ascii="Times New Roman" w:hAnsi="Times New Roman" w:cs="Times New Roman" w:eastAsia="Times New Roman"/>
+                      <w:b/>
+                      <w:color w:val="000000"/>
+                      <w:sz w:val="18"/>
+                    </w:rPr>
+                    <w:t>Rec. (%)</w:t>
+                  </w:r>
+                </w:p>
+              </w:tc>
+              <w:tc>
+                <w:tcPr>
+                  <w:tcW w:w="691" w:type="dxa"/>
+                </w:tcPr>
+                <w:p>
+                  <w:pPr>
+                    <w:pStyle w:val="Compact"/>
+                    <w:spacing w:line="240" w:lineRule="auto" w:before="0" w:after="0"/>
+                    <w:jc w:val="right"/>
+                    <w:jc w:val="center"/>
+                  </w:pPr>
+                  <w:r>
+                    <w:rPr>
+                      <w:rFonts w:ascii="Times New Roman" w:hAnsi="Times New Roman" w:cs="Times New Roman" w:eastAsia="Times New Roman"/>
+                      <w:b/>
+                      <w:color w:val="000000"/>
+                      <w:sz w:val="18"/>
+                    </w:rPr>
+                    <w:t>F0.5</w:t>
                   </w:r>
                 </w:p>
               </w:tc>
@@ -3804,7 +3908,7 @@
               </w:trPr>
               <w:tc>
                 <w:tcPr>
-                  <w:tcW w:w="1440" w:type="dxa"/>
+                  <w:tcW w:w="936" w:type="dxa"/>
                 </w:tcPr>
                 <w:p>
                   <w:pPr>
@@ -3825,7 +3929,7 @@
               </w:tc>
               <w:tc>
                 <w:tcPr>
-                  <w:tcW w:w="2016" w:type="dxa"/>
+                  <w:tcW w:w="2146" w:type="dxa"/>
                 </w:tcPr>
                 <w:p>
                   <w:pPr>
@@ -3846,7 +3950,7 @@
               </w:tc>
               <w:tc>
                 <w:tcPr>
-                  <w:tcW w:w="1440" w:type="dxa"/>
+                  <w:tcW w:w="835" w:type="dxa"/>
                 </w:tcPr>
                 <w:p>
                   <w:pPr>
@@ -3867,7 +3971,7 @@
               </w:tc>
               <w:tc>
                 <w:tcPr>
-                  <w:tcW w:w="1152" w:type="dxa"/>
+                  <w:tcW w:w="749" w:type="dxa"/>
                 </w:tcPr>
                 <w:p>
                   <w:pPr>
@@ -3888,7 +3992,7 @@
               </w:tc>
               <w:tc>
                 <w:tcPr>
-                  <w:tcW w:w="1440" w:type="dxa"/>
+                  <w:tcW w:w="893" w:type="dxa"/>
                 </w:tcPr>
                 <w:p>
                   <w:pPr>
@@ -3909,7 +4013,7 @@
               </w:tc>
               <w:tc>
                 <w:tcPr>
-                  <w:tcW w:w="1872" w:type="dxa"/>
+                  <w:tcW w:w="691" w:type="dxa"/>
                 </w:tcPr>
                 <w:p>
                   <w:pPr>
@@ -3925,6 +4029,90 @@
                       <w:sz w:val="18"/>
                     </w:rPr>
                     <w:t>—</w:t>
+                  </w:r>
+                </w:p>
+              </w:tc>
+              <w:tc>
+                <w:tcPr>
+                  <w:tcW w:w="835" w:type="dxa"/>
+                </w:tcPr>
+                <w:p>
+                  <w:pPr>
+                    <w:pStyle w:val="Compact"/>
+                    <w:spacing w:line="240" w:lineRule="auto" w:before="0" w:after="0"/>
+                    <w:jc w:val="right"/>
+                    <w:jc w:val="center"/>
+                  </w:pPr>
+                  <w:r>
+                    <w:rPr>
+                      <w:rFonts w:ascii="Times New Roman" w:hAnsi="Times New Roman" w:cs="Times New Roman" w:eastAsia="Times New Roman"/>
+                      <w:color w:val="000000"/>
+                      <w:sz w:val="18"/>
+                    </w:rPr>
+                    <w:t>0.2218</w:t>
+                  </w:r>
+                </w:p>
+              </w:tc>
+              <w:tc>
+                <w:tcPr>
+                  <w:tcW w:w="835" w:type="dxa"/>
+                </w:tcPr>
+                <w:p>
+                  <w:pPr>
+                    <w:pStyle w:val="Compact"/>
+                    <w:spacing w:line="240" w:lineRule="auto" w:before="0" w:after="0"/>
+                    <w:jc w:val="right"/>
+                    <w:jc w:val="center"/>
+                  </w:pPr>
+                  <w:r>
+                    <w:rPr>
+                      <w:rFonts w:ascii="Times New Roman" w:hAnsi="Times New Roman" w:cs="Times New Roman" w:eastAsia="Times New Roman"/>
+                      <w:color w:val="000000"/>
+                      <w:sz w:val="18"/>
+                    </w:rPr>
+                    <w:t>32.82</w:t>
+                  </w:r>
+                </w:p>
+              </w:tc>
+              <w:tc>
+                <w:tcPr>
+                  <w:tcW w:w="749" w:type="dxa"/>
+                </w:tcPr>
+                <w:p>
+                  <w:pPr>
+                    <w:pStyle w:val="Compact"/>
+                    <w:spacing w:line="240" w:lineRule="auto" w:before="0" w:after="0"/>
+                    <w:jc w:val="right"/>
+                    <w:jc w:val="center"/>
+                  </w:pPr>
+                  <w:r>
+                    <w:rPr>
+                      <w:rFonts w:ascii="Times New Roman" w:hAnsi="Times New Roman" w:cs="Times New Roman" w:eastAsia="Times New Roman"/>
+                      <w:color w:val="000000"/>
+                      <w:sz w:val="18"/>
+                    </w:rPr>
+                    <w:t>30.30</w:t>
+                  </w:r>
+                </w:p>
+              </w:tc>
+              <w:tc>
+                <w:tcPr>
+                  <w:tcW w:w="691" w:type="dxa"/>
+                </w:tcPr>
+                <w:p>
+                  <w:pPr>
+                    <w:pStyle w:val="Compact"/>
+                    <w:spacing w:line="240" w:lineRule="auto" w:before="0" w:after="0"/>
+                    <w:jc w:val="right"/>
+                    <w:jc w:val="center"/>
+                  </w:pPr>
+                  <w:r>
+                    <w:rPr>
+                      <w:rFonts w:ascii="Times New Roman" w:hAnsi="Times New Roman" w:cs="Times New Roman" w:eastAsia="Times New Roman"/>
+                      <w:color w:val="000000"/>
+                      <w:sz w:val="18"/>
+                    </w:rPr>
+                    <w:t>0.3228</w:t>
                   </w:r>
                 </w:p>
               </w:tc>
@@ -3935,7 +4123,7 @@
               </w:trPr>
               <w:tc>
                 <w:tcPr>
-                  <w:tcW w:w="1440" w:type="dxa"/>
+                  <w:tcW w:w="936" w:type="dxa"/>
                 </w:tcPr>
                 <w:p>
                   <w:pPr>
@@ -3956,7 +4144,7 @@
               </w:tc>
               <w:tc>
                 <w:tcPr>
-                  <w:tcW w:w="2016" w:type="dxa"/>
+                  <w:tcW w:w="2146" w:type="dxa"/>
                 </w:tcPr>
                 <w:p>
                   <w:pPr>
@@ -3977,7 +4165,7 @@
               </w:tc>
               <w:tc>
                 <w:tcPr>
-                  <w:tcW w:w="1440" w:type="dxa"/>
+                  <w:tcW w:w="835" w:type="dxa"/>
                 </w:tcPr>
                 <w:p>
                   <w:pPr>
@@ -3998,7 +4186,7 @@
               </w:tc>
               <w:tc>
                 <w:tcPr>
-                  <w:tcW w:w="1152" w:type="dxa"/>
+                  <w:tcW w:w="749" w:type="dxa"/>
                 </w:tcPr>
                 <w:p>
                   <w:pPr>
@@ -4019,7 +4207,7 @@
               </w:tc>
               <w:tc>
                 <w:tcPr>
-                  <w:tcW w:w="1440" w:type="dxa"/>
+                  <w:tcW w:w="893" w:type="dxa"/>
                 </w:tcPr>
                 <w:p>
                   <w:pPr>
@@ -4040,7 +4228,7 @@
               </w:tc>
               <w:tc>
                 <w:tcPr>
-                  <w:tcW w:w="1872" w:type="dxa"/>
+                  <w:tcW w:w="691" w:type="dxa"/>
                 </w:tcPr>
                 <w:p>
                   <w:pPr>
@@ -4056,6 +4244,90 @@
                       <w:sz w:val="18"/>
                     </w:rPr>
                     <w:t>≤0.001</w:t>
+                  </w:r>
+                </w:p>
+              </w:tc>
+              <w:tc>
+                <w:tcPr>
+                  <w:tcW w:w="835" w:type="dxa"/>
+                </w:tcPr>
+                <w:p>
+                  <w:pPr>
+                    <w:pStyle w:val="Compact"/>
+                    <w:spacing w:line="240" w:lineRule="auto" w:before="0" w:after="0"/>
+                    <w:jc w:val="right"/>
+                    <w:jc w:val="center"/>
+                  </w:pPr>
+                  <w:r>
+                    <w:rPr>
+                      <w:rFonts w:ascii="Times New Roman" w:hAnsi="Times New Roman" w:cs="Times New Roman" w:eastAsia="Times New Roman"/>
+                      <w:color w:val="000000"/>
+                      <w:sz w:val="18"/>
+                    </w:rPr>
+                    <w:t>0.3029</w:t>
+                  </w:r>
+                </w:p>
+              </w:tc>
+              <w:tc>
+                <w:tcPr>
+                  <w:tcW w:w="835" w:type="dxa"/>
+                </w:tcPr>
+                <w:p>
+                  <w:pPr>
+                    <w:pStyle w:val="Compact"/>
+                    <w:spacing w:line="240" w:lineRule="auto" w:before="0" w:after="0"/>
+                    <w:jc w:val="right"/>
+                    <w:jc w:val="center"/>
+                  </w:pPr>
+                  <w:r>
+                    <w:rPr>
+                      <w:rFonts w:ascii="Times New Roman" w:hAnsi="Times New Roman" w:cs="Times New Roman" w:eastAsia="Times New Roman"/>
+                      <w:color w:val="000000"/>
+                      <w:sz w:val="18"/>
+                    </w:rPr>
+                    <w:t>9.28</w:t>
+                  </w:r>
+                </w:p>
+              </w:tc>
+              <w:tc>
+                <w:tcPr>
+                  <w:tcW w:w="749" w:type="dxa"/>
+                </w:tcPr>
+                <w:p>
+                  <w:pPr>
+                    <w:pStyle w:val="Compact"/>
+                    <w:spacing w:line="240" w:lineRule="auto" w:before="0" w:after="0"/>
+                    <w:jc w:val="right"/>
+                    <w:jc w:val="center"/>
+                  </w:pPr>
+                  <w:r>
+                    <w:rPr>
+                      <w:rFonts w:ascii="Times New Roman" w:hAnsi="Times New Roman" w:cs="Times New Roman" w:eastAsia="Times New Roman"/>
+                      <w:color w:val="000000"/>
+                      <w:sz w:val="18"/>
+                    </w:rPr>
+                    <w:t>96.08</w:t>
+                  </w:r>
+                </w:p>
+              </w:tc>
+              <w:tc>
+                <w:tcPr>
+                  <w:tcW w:w="691" w:type="dxa"/>
+                </w:tcPr>
+                <w:p>
+                  <w:pPr>
+                    <w:pStyle w:val="Compact"/>
+                    <w:spacing w:line="240" w:lineRule="auto" w:before="0" w:after="0"/>
+                    <w:jc w:val="right"/>
+                    <w:jc w:val="center"/>
+                  </w:pPr>
+                  <w:r>
+                    <w:rPr>
+                      <w:rFonts w:ascii="Times New Roman" w:hAnsi="Times New Roman" w:cs="Times New Roman" w:eastAsia="Times New Roman"/>
+                      <w:color w:val="000000"/>
+                      <w:sz w:val="18"/>
+                    </w:rPr>
+                    <w:t>0.1133</w:t>
                   </w:r>
                 </w:p>
               </w:tc>
@@ -4066,7 +4338,7 @@
               </w:trPr>
               <w:tc>
                 <w:tcPr>
-                  <w:tcW w:w="1440" w:type="dxa"/>
+                  <w:tcW w:w="936" w:type="dxa"/>
                 </w:tcPr>
                 <w:p>
                   <w:pPr>
@@ -4087,7 +4359,7 @@
               </w:tc>
               <w:tc>
                 <w:tcPr>
-                  <w:tcW w:w="2016" w:type="dxa"/>
+                  <w:tcW w:w="2146" w:type="dxa"/>
                 </w:tcPr>
                 <w:p>
                   <w:pPr>
@@ -4108,7 +4380,7 @@
               </w:tc>
               <w:tc>
                 <w:tcPr>
-                  <w:tcW w:w="1440" w:type="dxa"/>
+                  <w:tcW w:w="835" w:type="dxa"/>
                 </w:tcPr>
                 <w:p>
                   <w:pPr>
@@ -4129,7 +4401,7 @@
               </w:tc>
               <w:tc>
                 <w:tcPr>
-                  <w:tcW w:w="1152" w:type="dxa"/>
+                  <w:tcW w:w="749" w:type="dxa"/>
                 </w:tcPr>
                 <w:p>
                   <w:pPr>
@@ -4150,7 +4422,7 @@
               </w:tc>
               <w:tc>
                 <w:tcPr>
-                  <w:tcW w:w="1440" w:type="dxa"/>
+                  <w:tcW w:w="893" w:type="dxa"/>
                 </w:tcPr>
                 <w:p>
                   <w:pPr>
@@ -4171,7 +4443,7 @@
               </w:tc>
               <w:tc>
                 <w:tcPr>
-                  <w:tcW w:w="1872" w:type="dxa"/>
+                  <w:tcW w:w="691" w:type="dxa"/>
                 </w:tcPr>
                 <w:p>
                   <w:pPr>
@@ -4187,6 +4459,90 @@
                       <w:sz w:val="18"/>
                     </w:rPr>
                     <w:t>≤0.001</w:t>
+                  </w:r>
+                </w:p>
+              </w:tc>
+              <w:tc>
+                <w:tcPr>
+                  <w:tcW w:w="835" w:type="dxa"/>
+                </w:tcPr>
+                <w:p>
+                  <w:pPr>
+                    <w:pStyle w:val="Compact"/>
+                    <w:spacing w:line="240" w:lineRule="auto" w:before="0" w:after="0"/>
+                    <w:jc w:val="right"/>
+                    <w:jc w:val="center"/>
+                  </w:pPr>
+                  <w:r>
+                    <w:rPr>
+                      <w:rFonts w:ascii="Times New Roman" w:hAnsi="Times New Roman" w:cs="Times New Roman" w:eastAsia="Times New Roman"/>
+                      <w:color w:val="000000"/>
+                      <w:sz w:val="18"/>
+                    </w:rPr>
+                    <w:t>0.8963</w:t>
+                  </w:r>
+                </w:p>
+              </w:tc>
+              <w:tc>
+                <w:tcPr>
+                  <w:tcW w:w="835" w:type="dxa"/>
+                </w:tcPr>
+                <w:p>
+                  <w:pPr>
+                    <w:pStyle w:val="Compact"/>
+                    <w:spacing w:line="240" w:lineRule="auto" w:before="0" w:after="0"/>
+                    <w:jc w:val="right"/>
+                    <w:jc w:val="center"/>
+                  </w:pPr>
+                  <w:r>
+                    <w:rPr>
+                      <w:rFonts w:ascii="Times New Roman" w:hAnsi="Times New Roman" w:cs="Times New Roman" w:eastAsia="Times New Roman"/>
+                      <w:color w:val="000000"/>
+                      <w:sz w:val="18"/>
+                    </w:rPr>
+                    <w:t>11.72</w:t>
+                  </w:r>
+                </w:p>
+              </w:tc>
+              <w:tc>
+                <w:tcPr>
+                  <w:tcW w:w="749" w:type="dxa"/>
+                </w:tcPr>
+                <w:p>
+                  <w:pPr>
+                    <w:pStyle w:val="Compact"/>
+                    <w:spacing w:line="240" w:lineRule="auto" w:before="0" w:after="0"/>
+                    <w:jc w:val="right"/>
+                    <w:jc w:val="center"/>
+                  </w:pPr>
+                  <w:r>
+                    <w:rPr>
+                      <w:rFonts w:ascii="Times New Roman" w:hAnsi="Times New Roman" w:cs="Times New Roman" w:eastAsia="Times New Roman"/>
+                      <w:color w:val="000000"/>
+                      <w:sz w:val="18"/>
+                    </w:rPr>
+                    <w:t>12.57</w:t>
+                  </w:r>
+                </w:p>
+              </w:tc>
+              <w:tc>
+                <w:tcPr>
+                  <w:tcW w:w="691" w:type="dxa"/>
+                </w:tcPr>
+                <w:p>
+                  <w:pPr>
+                    <w:pStyle w:val="Compact"/>
+                    <w:spacing w:line="240" w:lineRule="auto" w:before="0" w:after="0"/>
+                    <w:jc w:val="right"/>
+                    <w:jc w:val="center"/>
+                  </w:pPr>
+                  <w:r>
+                    <w:rPr>
+                      <w:rFonts w:ascii="Times New Roman" w:hAnsi="Times New Roman" w:cs="Times New Roman" w:eastAsia="Times New Roman"/>
+                      <w:color w:val="000000"/>
+                      <w:sz w:val="18"/>
+                    </w:rPr>
+                    <w:t>0.1188</w:t>
                   </w:r>
                 </w:p>
               </w:tc>
@@ -4197,7 +4553,7 @@
               </w:trPr>
               <w:tc>
                 <w:tcPr>
-                  <w:tcW w:w="1440" w:type="dxa"/>
+                  <w:tcW w:w="936" w:type="dxa"/>
                 </w:tcPr>
                 <w:p>
                   <w:pPr>
@@ -4218,7 +4574,7 @@
               </w:tc>
               <w:tc>
                 <w:tcPr>
-                  <w:tcW w:w="2016" w:type="dxa"/>
+                  <w:tcW w:w="2146" w:type="dxa"/>
                 </w:tcPr>
                 <w:p>
                   <w:pPr>
@@ -4239,7 +4595,7 @@
               </w:tc>
               <w:tc>
                 <w:tcPr>
-                  <w:tcW w:w="1440" w:type="dxa"/>
+                  <w:tcW w:w="835" w:type="dxa"/>
                 </w:tcPr>
                 <w:p>
                   <w:pPr>
@@ -4260,7 +4616,7 @@
               </w:tc>
               <w:tc>
                 <w:tcPr>
-                  <w:tcW w:w="1152" w:type="dxa"/>
+                  <w:tcW w:w="749" w:type="dxa"/>
                 </w:tcPr>
                 <w:p>
                   <w:pPr>
@@ -4281,7 +4637,7 @@
               </w:tc>
               <w:tc>
                 <w:tcPr>
-                  <w:tcW w:w="1440" w:type="dxa"/>
+                  <w:tcW w:w="893" w:type="dxa"/>
                 </w:tcPr>
                 <w:p>
                   <w:pPr>
@@ -4302,7 +4658,7 @@
               </w:tc>
               <w:tc>
                 <w:tcPr>
-                  <w:tcW w:w="1872" w:type="dxa"/>
+                  <w:tcW w:w="691" w:type="dxa"/>
                 </w:tcPr>
                 <w:p>
                   <w:pPr>
@@ -4318,6 +4674,90 @@
                       <w:sz w:val="18"/>
                     </w:rPr>
                     <w:t>—</w:t>
+                  </w:r>
+                </w:p>
+              </w:tc>
+              <w:tc>
+                <w:tcPr>
+                  <w:tcW w:w="835" w:type="dxa"/>
+                </w:tcPr>
+                <w:p>
+                  <w:pPr>
+                    <w:pStyle w:val="Compact"/>
+                    <w:spacing w:line="240" w:lineRule="auto" w:before="0" w:after="0"/>
+                    <w:jc w:val="right"/>
+                    <w:jc w:val="center"/>
+                  </w:pPr>
+                  <w:r>
+                    <w:rPr>
+                      <w:rFonts w:ascii="Times New Roman" w:hAnsi="Times New Roman" w:cs="Times New Roman" w:eastAsia="Times New Roman"/>
+                      <w:color w:val="000000"/>
+                      <w:sz w:val="18"/>
+                    </w:rPr>
+                    <w:t>0.2186</w:t>
+                  </w:r>
+                </w:p>
+              </w:tc>
+              <w:tc>
+                <w:tcPr>
+                  <w:tcW w:w="835" w:type="dxa"/>
+                </w:tcPr>
+                <w:p>
+                  <w:pPr>
+                    <w:pStyle w:val="Compact"/>
+                    <w:spacing w:line="240" w:lineRule="auto" w:before="0" w:after="0"/>
+                    <w:jc w:val="right"/>
+                    <w:jc w:val="center"/>
+                  </w:pPr>
+                  <w:r>
+                    <w:rPr>
+                      <w:rFonts w:ascii="Times New Roman" w:hAnsi="Times New Roman" w:cs="Times New Roman" w:eastAsia="Times New Roman"/>
+                      <w:color w:val="000000"/>
+                      <w:sz w:val="18"/>
+                    </w:rPr>
+                    <w:t>30.13</w:t>
+                  </w:r>
+                </w:p>
+              </w:tc>
+              <w:tc>
+                <w:tcPr>
+                  <w:tcW w:w="749" w:type="dxa"/>
+                </w:tcPr>
+                <w:p>
+                  <w:pPr>
+                    <w:pStyle w:val="Compact"/>
+                    <w:spacing w:line="240" w:lineRule="auto" w:before="0" w:after="0"/>
+                    <w:jc w:val="right"/>
+                    <w:jc w:val="center"/>
+                  </w:pPr>
+                  <w:r>
+                    <w:rPr>
+                      <w:rFonts w:ascii="Times New Roman" w:hAnsi="Times New Roman" w:cs="Times New Roman" w:eastAsia="Times New Roman"/>
+                      <w:color w:val="000000"/>
+                      <w:sz w:val="18"/>
+                    </w:rPr>
+                    <w:t>18.59</w:t>
+                  </w:r>
+                </w:p>
+              </w:tc>
+              <w:tc>
+                <w:tcPr>
+                  <w:tcW w:w="691" w:type="dxa"/>
+                </w:tcPr>
+                <w:p>
+                  <w:pPr>
+                    <w:pStyle w:val="Compact"/>
+                    <w:spacing w:line="240" w:lineRule="auto" w:before="0" w:after="0"/>
+                    <w:jc w:val="right"/>
+                    <w:jc w:val="center"/>
+                  </w:pPr>
+                  <w:r>
+                    <w:rPr>
+                      <w:rFonts w:ascii="Times New Roman" w:hAnsi="Times New Roman" w:cs="Times New Roman" w:eastAsia="Times New Roman"/>
+                      <w:color w:val="000000"/>
+                      <w:sz w:val="18"/>
+                    </w:rPr>
+                    <w:t>0.2680</w:t>
                   </w:r>
                 </w:p>
               </w:tc>
@@ -4328,7 +4768,7 @@
               </w:trPr>
               <w:tc>
                 <w:tcPr>
-                  <w:tcW w:w="1440" w:type="dxa"/>
+                  <w:tcW w:w="936" w:type="dxa"/>
                 </w:tcPr>
                 <w:p>
                   <w:pPr>
@@ -4349,7 +4789,7 @@
               </w:tc>
               <w:tc>
                 <w:tcPr>
-                  <w:tcW w:w="2016" w:type="dxa"/>
+                  <w:tcW w:w="2146" w:type="dxa"/>
                 </w:tcPr>
                 <w:p>
                   <w:pPr>
@@ -4370,7 +4810,7 @@
               </w:tc>
               <w:tc>
                 <w:tcPr>
-                  <w:tcW w:w="1440" w:type="dxa"/>
+                  <w:tcW w:w="835" w:type="dxa"/>
                 </w:tcPr>
                 <w:p>
                   <w:pPr>
@@ -4391,7 +4831,7 @@
               </w:tc>
               <w:tc>
                 <w:tcPr>
-                  <w:tcW w:w="1152" w:type="dxa"/>
+                  <w:tcW w:w="749" w:type="dxa"/>
                 </w:tcPr>
                 <w:p>
                   <w:pPr>
@@ -4412,7 +4852,7 @@
               </w:tc>
               <w:tc>
                 <w:tcPr>
-                  <w:tcW w:w="1440" w:type="dxa"/>
+                  <w:tcW w:w="893" w:type="dxa"/>
                 </w:tcPr>
                 <w:p>
                   <w:pPr>
@@ -4433,7 +4873,7 @@
               </w:tc>
               <w:tc>
                 <w:tcPr>
-                  <w:tcW w:w="1872" w:type="dxa"/>
+                  <w:tcW w:w="691" w:type="dxa"/>
                 </w:tcPr>
                 <w:p>
                   <w:pPr>
@@ -4449,6 +4889,90 @@
                       <w:sz w:val="18"/>
                     </w:rPr>
                     <w:t>≤0.001</w:t>
+                  </w:r>
+                </w:p>
+              </w:tc>
+              <w:tc>
+                <w:tcPr>
+                  <w:tcW w:w="835" w:type="dxa"/>
+                </w:tcPr>
+                <w:p>
+                  <w:pPr>
+                    <w:pStyle w:val="Compact"/>
+                    <w:spacing w:line="240" w:lineRule="auto" w:before="0" w:after="0"/>
+                    <w:jc w:val="right"/>
+                    <w:jc w:val="center"/>
+                  </w:pPr>
+                  <w:r>
+                    <w:rPr>
+                      <w:rFonts w:ascii="Times New Roman" w:hAnsi="Times New Roman" w:cs="Times New Roman" w:eastAsia="Times New Roman"/>
+                      <w:color w:val="000000"/>
+                      <w:sz w:val="18"/>
+                    </w:rPr>
+                    <w:t>2.1509</w:t>
+                  </w:r>
+                </w:p>
+              </w:tc>
+              <w:tc>
+                <w:tcPr>
+                  <w:tcW w:w="835" w:type="dxa"/>
+                </w:tcPr>
+                <w:p>
+                  <w:pPr>
+                    <w:pStyle w:val="Compact"/>
+                    <w:spacing w:line="240" w:lineRule="auto" w:before="0" w:after="0"/>
+                    <w:jc w:val="right"/>
+                    <w:jc w:val="center"/>
+                  </w:pPr>
+                  <w:r>
+                    <w:rPr>
+                      <w:rFonts w:ascii="Times New Roman" w:hAnsi="Times New Roman" w:cs="Times New Roman" w:eastAsia="Times New Roman"/>
+                      <w:color w:val="000000"/>
+                      <w:sz w:val="18"/>
+                    </w:rPr>
+                    <w:t>10.76</w:t>
+                  </w:r>
+                </w:p>
+              </w:tc>
+              <w:tc>
+                <w:tcPr>
+                  <w:tcW w:w="749" w:type="dxa"/>
+                </w:tcPr>
+                <w:p>
+                  <w:pPr>
+                    <w:pStyle w:val="Compact"/>
+                    <w:spacing w:line="240" w:lineRule="auto" w:before="0" w:after="0"/>
+                    <w:jc w:val="right"/>
+                    <w:jc w:val="center"/>
+                  </w:pPr>
+                  <w:r>
+                    <w:rPr>
+                      <w:rFonts w:ascii="Times New Roman" w:hAnsi="Times New Roman" w:cs="Times New Roman" w:eastAsia="Times New Roman"/>
+                      <w:color w:val="000000"/>
+                      <w:sz w:val="18"/>
+                    </w:rPr>
+                    <w:t>38.99</w:t>
+                  </w:r>
+                </w:p>
+              </w:tc>
+              <w:tc>
+                <w:tcPr>
+                  <w:tcW w:w="691" w:type="dxa"/>
+                </w:tcPr>
+                <w:p>
+                  <w:pPr>
+                    <w:pStyle w:val="Compact"/>
+                    <w:spacing w:line="240" w:lineRule="auto" w:before="0" w:after="0"/>
+                    <w:jc w:val="right"/>
+                    <w:jc w:val="center"/>
+                  </w:pPr>
+                  <w:r>
+                    <w:rPr>
+                      <w:rFonts w:ascii="Times New Roman" w:hAnsi="Times New Roman" w:cs="Times New Roman" w:eastAsia="Times New Roman"/>
+                      <w:color w:val="000000"/>
+                      <w:sz w:val="18"/>
+                    </w:rPr>
+                    <w:t>0.1258</w:t>
                   </w:r>
                 </w:p>
               </w:tc>
@@ -4459,7 +4983,7 @@
               </w:trPr>
               <w:tc>
                 <w:tcPr>
-                  <w:tcW w:w="1440" w:type="dxa"/>
+                  <w:tcW w:w="936" w:type="dxa"/>
                 </w:tcPr>
                 <w:p>
                   <w:pPr>
@@ -4480,7 +5004,7 @@
               </w:tc>
               <w:tc>
                 <w:tcPr>
-                  <w:tcW w:w="2016" w:type="dxa"/>
+                  <w:tcW w:w="2146" w:type="dxa"/>
                 </w:tcPr>
                 <w:p>
                   <w:pPr>
@@ -4501,7 +5025,7 @@
               </w:tc>
               <w:tc>
                 <w:tcPr>
-                  <w:tcW w:w="1440" w:type="dxa"/>
+                  <w:tcW w:w="835" w:type="dxa"/>
                 </w:tcPr>
                 <w:p>
                   <w:pPr>
@@ -4522,7 +5046,7 @@
               </w:tc>
               <w:tc>
                 <w:tcPr>
-                  <w:tcW w:w="1152" w:type="dxa"/>
+                  <w:tcW w:w="749" w:type="dxa"/>
                 </w:tcPr>
                 <w:p>
                   <w:pPr>
@@ -4543,7 +5067,7 @@
               </w:tc>
               <w:tc>
                 <w:tcPr>
-                  <w:tcW w:w="1440" w:type="dxa"/>
+                  <w:tcW w:w="893" w:type="dxa"/>
                 </w:tcPr>
                 <w:p>
                   <w:pPr>
@@ -4564,7 +5088,7 @@
               </w:tc>
               <w:tc>
                 <w:tcPr>
-                  <w:tcW w:w="1872" w:type="dxa"/>
+                  <w:tcW w:w="691" w:type="dxa"/>
                 </w:tcPr>
                 <w:p>
                   <w:pPr>
@@ -4580,6 +5104,90 @@
                       <w:sz w:val="18"/>
                     </w:rPr>
                     <w:t>≤0.001</w:t>
+                  </w:r>
+                </w:p>
+              </w:tc>
+              <w:tc>
+                <w:tcPr>
+                  <w:tcW w:w="835" w:type="dxa"/>
+                </w:tcPr>
+                <w:p>
+                  <w:pPr>
+                    <w:pStyle w:val="Compact"/>
+                    <w:spacing w:line="240" w:lineRule="auto" w:before="0" w:after="0"/>
+                    <w:jc w:val="right"/>
+                    <w:jc w:val="center"/>
+                  </w:pPr>
+                  <w:r>
+                    <w:rPr>
+                      <w:rFonts w:ascii="Times New Roman" w:hAnsi="Times New Roman" w:cs="Times New Roman" w:eastAsia="Times New Roman"/>
+                      <w:color w:val="000000"/>
+                      <w:sz w:val="18"/>
+                    </w:rPr>
+                    <w:t>0.0750</w:t>
+                  </w:r>
+                </w:p>
+              </w:tc>
+              <w:tc>
+                <w:tcPr>
+                  <w:tcW w:w="835" w:type="dxa"/>
+                </w:tcPr>
+                <w:p>
+                  <w:pPr>
+                    <w:pStyle w:val="Compact"/>
+                    <w:spacing w:line="240" w:lineRule="auto" w:before="0" w:after="0"/>
+                    <w:jc w:val="right"/>
+                    <w:jc w:val="center"/>
+                  </w:pPr>
+                  <w:r>
+                    <w:rPr>
+                      <w:rFonts w:ascii="Times New Roman" w:hAnsi="Times New Roman" w:cs="Times New Roman" w:eastAsia="Times New Roman"/>
+                      <w:color w:val="000000"/>
+                      <w:sz w:val="18"/>
+                    </w:rPr>
+                    <w:t>9.24</w:t>
+                  </w:r>
+                </w:p>
+              </w:tc>
+              <w:tc>
+                <w:tcPr>
+                  <w:tcW w:w="749" w:type="dxa"/>
+                </w:tcPr>
+                <w:p>
+                  <w:pPr>
+                    <w:pStyle w:val="Compact"/>
+                    <w:spacing w:line="240" w:lineRule="auto" w:before="0" w:after="0"/>
+                    <w:jc w:val="right"/>
+                    <w:jc w:val="center"/>
+                  </w:pPr>
+                  <w:r>
+                    <w:rPr>
+                      <w:rFonts w:ascii="Times New Roman" w:hAnsi="Times New Roman" w:cs="Times New Roman" w:eastAsia="Times New Roman"/>
+                      <w:color w:val="000000"/>
+                      <w:sz w:val="18"/>
+                    </w:rPr>
+                    <w:t>79.47</w:t>
+                  </w:r>
+                </w:p>
+              </w:tc>
+              <w:tc>
+                <w:tcPr>
+                  <w:tcW w:w="691" w:type="dxa"/>
+                </w:tcPr>
+                <w:p>
+                  <w:pPr>
+                    <w:pStyle w:val="Compact"/>
+                    <w:spacing w:line="240" w:lineRule="auto" w:before="0" w:after="0"/>
+                    <w:jc w:val="right"/>
+                    <w:jc w:val="center"/>
+                  </w:pPr>
+                  <w:r>
+                    <w:rPr>
+                      <w:rFonts w:ascii="Times New Roman" w:hAnsi="Times New Roman" w:cs="Times New Roman" w:eastAsia="Times New Roman"/>
+                      <w:color w:val="000000"/>
+                      <w:sz w:val="18"/>
+                    </w:rPr>
+                    <w:t>0.1123</w:t>
                   </w:r>
                 </w:p>
               </w:tc>
@@ -4590,7 +5198,7 @@
               </w:trPr>
               <w:tc>
                 <w:tcPr>
-                  <w:tcW w:w="1440" w:type="dxa"/>
+                  <w:tcW w:w="936" w:type="dxa"/>
                 </w:tcPr>
                 <w:p>
                   <w:pPr>
@@ -4611,7 +5219,7 @@
               </w:tc>
               <w:tc>
                 <w:tcPr>
-                  <w:tcW w:w="2016" w:type="dxa"/>
+                  <w:tcW w:w="2146" w:type="dxa"/>
                 </w:tcPr>
                 <w:p>
                   <w:pPr>
@@ -4632,7 +5240,7 @@
               </w:tc>
               <w:tc>
                 <w:tcPr>
-                  <w:tcW w:w="1440" w:type="dxa"/>
+                  <w:tcW w:w="835" w:type="dxa"/>
                 </w:tcPr>
                 <w:p>
                   <w:pPr>
@@ -4653,7 +5261,7 @@
               </w:tc>
               <w:tc>
                 <w:tcPr>
-                  <w:tcW w:w="1152" w:type="dxa"/>
+                  <w:tcW w:w="749" w:type="dxa"/>
                 </w:tcPr>
                 <w:p>
                   <w:pPr>
@@ -4674,7 +5282,7 @@
               </w:tc>
               <w:tc>
                 <w:tcPr>
-                  <w:tcW w:w="1440" w:type="dxa"/>
+                  <w:tcW w:w="893" w:type="dxa"/>
                 </w:tcPr>
                 <w:p>
                   <w:pPr>
@@ -4695,7 +5303,91 @@
               </w:tc>
               <w:tc>
                 <w:tcPr>
-                  <w:tcW w:w="1872" w:type="dxa"/>
+                  <w:tcW w:w="691" w:type="dxa"/>
+                </w:tcPr>
+                <w:p>
+                  <w:pPr>
+                    <w:pStyle w:val="Compact"/>
+                    <w:spacing w:line="240" w:lineRule="auto" w:before="0" w:after="0"/>
+                    <w:jc w:val="right"/>
+                    <w:jc w:val="center"/>
+                  </w:pPr>
+                  <w:r>
+                    <w:rPr>
+                      <w:rFonts w:ascii="Times New Roman" w:hAnsi="Times New Roman" w:cs="Times New Roman" w:eastAsia="Times New Roman"/>
+                      <w:color w:val="000000"/>
+                      <w:sz w:val="18"/>
+                    </w:rPr>
+                    <w:t>—</w:t>
+                  </w:r>
+                </w:p>
+              </w:tc>
+              <w:tc>
+                <w:tcPr>
+                  <w:tcW w:w="835" w:type="dxa"/>
+                </w:tcPr>
+                <w:p>
+                  <w:pPr>
+                    <w:pStyle w:val="Compact"/>
+                    <w:spacing w:line="240" w:lineRule="auto" w:before="0" w:after="0"/>
+                    <w:jc w:val="right"/>
+                    <w:jc w:val="center"/>
+                  </w:pPr>
+                  <w:r>
+                    <w:rPr>
+                      <w:rFonts w:ascii="Times New Roman" w:hAnsi="Times New Roman" w:cs="Times New Roman" w:eastAsia="Times New Roman"/>
+                      <w:color w:val="000000"/>
+                      <w:sz w:val="18"/>
+                    </w:rPr>
+                    <w:t>—</w:t>
+                  </w:r>
+                </w:p>
+              </w:tc>
+              <w:tc>
+                <w:tcPr>
+                  <w:tcW w:w="835" w:type="dxa"/>
+                </w:tcPr>
+                <w:p>
+                  <w:pPr>
+                    <w:pStyle w:val="Compact"/>
+                    <w:spacing w:line="240" w:lineRule="auto" w:before="0" w:after="0"/>
+                    <w:jc w:val="right"/>
+                    <w:jc w:val="center"/>
+                  </w:pPr>
+                  <w:r>
+                    <w:rPr>
+                      <w:rFonts w:ascii="Times New Roman" w:hAnsi="Times New Roman" w:cs="Times New Roman" w:eastAsia="Times New Roman"/>
+                      <w:color w:val="000000"/>
+                      <w:sz w:val="18"/>
+                    </w:rPr>
+                    <w:t>—</w:t>
+                  </w:r>
+                </w:p>
+              </w:tc>
+              <w:tc>
+                <w:tcPr>
+                  <w:tcW w:w="749" w:type="dxa"/>
+                </w:tcPr>
+                <w:p>
+                  <w:pPr>
+                    <w:pStyle w:val="Compact"/>
+                    <w:spacing w:line="240" w:lineRule="auto" w:before="0" w:after="0"/>
+                    <w:jc w:val="right"/>
+                    <w:jc w:val="center"/>
+                  </w:pPr>
+                  <w:r>
+                    <w:rPr>
+                      <w:rFonts w:ascii="Times New Roman" w:hAnsi="Times New Roman" w:cs="Times New Roman" w:eastAsia="Times New Roman"/>
+                      <w:color w:val="000000"/>
+                      <w:sz w:val="18"/>
+                    </w:rPr>
+                    <w:t>—</w:t>
+                  </w:r>
+                </w:p>
+              </w:tc>
+              <w:tc>
+                <w:tcPr>
+                  <w:tcW w:w="691" w:type="dxa"/>
                 </w:tcPr>
                 <w:p>
                   <w:pPr>
@@ -4721,7 +5413,7 @@
               </w:trPr>
               <w:tc>
                 <w:tcPr>
-                  <w:tcW w:w="1440" w:type="dxa"/>
+                  <w:tcW w:w="936" w:type="dxa"/>
                 </w:tcPr>
                 <w:p>
                   <w:pPr>
@@ -4742,7 +5434,7 @@
               </w:tc>
               <w:tc>
                 <w:tcPr>
-                  <w:tcW w:w="2016" w:type="dxa"/>
+                  <w:tcW w:w="2146" w:type="dxa"/>
                 </w:tcPr>
                 <w:p>
                   <w:pPr>
@@ -4763,7 +5455,7 @@
               </w:tc>
               <w:tc>
                 <w:tcPr>
-                  <w:tcW w:w="1440" w:type="dxa"/>
+                  <w:tcW w:w="835" w:type="dxa"/>
                 </w:tcPr>
                 <w:p>
                   <w:pPr>
@@ -4784,7 +5476,7 @@
               </w:tc>
               <w:tc>
                 <w:tcPr>
-                  <w:tcW w:w="1152" w:type="dxa"/>
+                  <w:tcW w:w="749" w:type="dxa"/>
                 </w:tcPr>
                 <w:p>
                   <w:pPr>
@@ -4805,7 +5497,7 @@
               </w:tc>
               <w:tc>
                 <w:tcPr>
-                  <w:tcW w:w="1440" w:type="dxa"/>
+                  <w:tcW w:w="893" w:type="dxa"/>
                 </w:tcPr>
                 <w:p>
                   <w:pPr>
@@ -4826,7 +5518,91 @@
               </w:tc>
               <w:tc>
                 <w:tcPr>
-                  <w:tcW w:w="1872" w:type="dxa"/>
+                  <w:tcW w:w="691" w:type="dxa"/>
+                </w:tcPr>
+                <w:p>
+                  <w:pPr>
+                    <w:pStyle w:val="Compact"/>
+                    <w:spacing w:line="240" w:lineRule="auto" w:before="0" w:after="0"/>
+                    <w:jc w:val="right"/>
+                    <w:jc w:val="center"/>
+                  </w:pPr>
+                  <w:r>
+                    <w:rPr>
+                      <w:rFonts w:ascii="Times New Roman" w:hAnsi="Times New Roman" w:cs="Times New Roman" w:eastAsia="Times New Roman"/>
+                      <w:color w:val="000000"/>
+                      <w:sz w:val="18"/>
+                    </w:rPr>
+                    <w:t>—</w:t>
+                  </w:r>
+                </w:p>
+              </w:tc>
+              <w:tc>
+                <w:tcPr>
+                  <w:tcW w:w="835" w:type="dxa"/>
+                </w:tcPr>
+                <w:p>
+                  <w:pPr>
+                    <w:pStyle w:val="Compact"/>
+                    <w:spacing w:line="240" w:lineRule="auto" w:before="0" w:after="0"/>
+                    <w:jc w:val="right"/>
+                    <w:jc w:val="center"/>
+                  </w:pPr>
+                  <w:r>
+                    <w:rPr>
+                      <w:rFonts w:ascii="Times New Roman" w:hAnsi="Times New Roman" w:cs="Times New Roman" w:eastAsia="Times New Roman"/>
+                      <w:color w:val="000000"/>
+                      <w:sz w:val="18"/>
+                    </w:rPr>
+                    <w:t>—</w:t>
+                  </w:r>
+                </w:p>
+              </w:tc>
+              <w:tc>
+                <w:tcPr>
+                  <w:tcW w:w="835" w:type="dxa"/>
+                </w:tcPr>
+                <w:p>
+                  <w:pPr>
+                    <w:pStyle w:val="Compact"/>
+                    <w:spacing w:line="240" w:lineRule="auto" w:before="0" w:after="0"/>
+                    <w:jc w:val="right"/>
+                    <w:jc w:val="center"/>
+                  </w:pPr>
+                  <w:r>
+                    <w:rPr>
+                      <w:rFonts w:ascii="Times New Roman" w:hAnsi="Times New Roman" w:cs="Times New Roman" w:eastAsia="Times New Roman"/>
+                      <w:color w:val="000000"/>
+                      <w:sz w:val="18"/>
+                    </w:rPr>
+                    <w:t>—</w:t>
+                  </w:r>
+                </w:p>
+              </w:tc>
+              <w:tc>
+                <w:tcPr>
+                  <w:tcW w:w="749" w:type="dxa"/>
+                </w:tcPr>
+                <w:p>
+                  <w:pPr>
+                    <w:pStyle w:val="Compact"/>
+                    <w:spacing w:line="240" w:lineRule="auto" w:before="0" w:after="0"/>
+                    <w:jc w:val="right"/>
+                    <w:jc w:val="center"/>
+                  </w:pPr>
+                  <w:r>
+                    <w:rPr>
+                      <w:rFonts w:ascii="Times New Roman" w:hAnsi="Times New Roman" w:cs="Times New Roman" w:eastAsia="Times New Roman"/>
+                      <w:color w:val="000000"/>
+                      <w:sz w:val="18"/>
+                    </w:rPr>
+                    <w:t>—</w:t>
+                  </w:r>
+                </w:p>
+              </w:tc>
+              <w:tc>
+                <w:tcPr>
+                  <w:tcW w:w="691" w:type="dxa"/>
                 </w:tcPr>
                 <w:p>
                   <w:pPr>
@@ -4921,7 +5697,7 @@
                     <a:graphicData uri="http://schemas.openxmlformats.org/drawingml/2006/picture">
                       <pic:pic>
                         <pic:nvPicPr>
-                          <pic:cNvPr descr="figuras/fig05_benchmarking_curvas_roc_pr.png" id="34" name="Picture"/>
+                          <pic:cNvPr descr="../../entregables/figuras/fig05_benchmarking_curvas_roc_pr.png" id="34" name="Picture"/>
                           <pic:cNvPicPr>
                             <a:picLocks noChangeArrowheads="1" noChangeAspect="1"/>
                           </pic:cNvPicPr>
@@ -5857,7 +6633,7 @@
                     <a:graphicData uri="http://schemas.openxmlformats.org/drawingml/2006/picture">
                       <pic:pic>
                         <pic:nvPicPr>
-                          <pic:cNvPr descr="figuras/fig03_mapa_riesgo_operativo_nacional.png" id="41" name="Picture"/>
+                          <pic:cNvPr descr="../../entregables/figuras/fig03_mapa_riesgo_operativo_nacional.png" id="41" name="Picture"/>
                           <pic:cNvPicPr>
                             <a:picLocks noChangeArrowheads="1" noChangeAspect="1"/>
                           </pic:cNvPicPr>

</xml_diff>